<commit_message>
Explain all three sections of every grammar file and show every T5 input in the report
Co-Authored-By: Claude Opus 5.5 <noreply@anthropic.com>
Claude-Session: https://claude.ai/code/session_01QcNyLCXcvqPYgnNJtFAvRc
</commit_message>
<xml_diff>
--- a/mini_project/report_editable.docx
+++ b/mini_project/report_editable.docx
@@ -906,7 +906,7 @@
             <w:r>
               <w:rPr>
                 <w:rFonts w:ascii="Courier New" w:hAnsi="Courier New" w:eastAsia="Courier New"/>
-                <w:sz w:val="18"/>
+                <w:sz w:val="17"/>
               </w:rPr>
               <w:t>sudo apt update</w:t>
               <w:br/>
@@ -914,7 +914,7 @@
             <w:r>
               <w:rPr>
                 <w:rFonts w:ascii="Courier New" w:hAnsi="Courier New" w:eastAsia="Courier New"/>
-                <w:sz w:val="18"/>
+                <w:sz w:val="17"/>
               </w:rPr>
               <w:t>sudo apt install -y flex bison gcc make</w:t>
               <w:br/>
@@ -922,7 +922,7 @@
             <w:r>
               <w:rPr>
                 <w:rFonts w:ascii="Courier New" w:hAnsi="Courier New" w:eastAsia="Courier New"/>
-                <w:sz w:val="18"/>
+                <w:sz w:val="17"/>
               </w:rPr>
               <w:t>flex --version</w:t>
               <w:br/>
@@ -930,7 +930,7 @@
             <w:r>
               <w:rPr>
                 <w:rFonts w:ascii="Courier New" w:hAnsi="Courier New" w:eastAsia="Courier New"/>
-                <w:sz w:val="18"/>
+                <w:sz w:val="17"/>
               </w:rPr>
               <w:t>bison --version</w:t>
               <w:br/>
@@ -938,7 +938,7 @@
             <w:r>
               <w:rPr>
                 <w:rFonts w:ascii="Courier New" w:hAnsi="Courier New" w:eastAsia="Courier New"/>
-                <w:sz w:val="18"/>
+                <w:sz w:val="17"/>
               </w:rPr>
               <w:t>gcc --version</w:t>
               <w:br/>
@@ -946,7 +946,7 @@
             <w:r>
               <w:rPr>
                 <w:rFonts w:ascii="Courier New" w:hAnsi="Courier New" w:eastAsia="Courier New"/>
-                <w:sz w:val="18"/>
+                <w:sz w:val="17"/>
               </w:rPr>
               <w:t>uname -a</w:t>
             </w:r>
@@ -1732,6 +1732,1084 @@
     </w:p>
     <w:p>
       <w:pPr>
+        <w:keepNext/>
+        <w:spacing w:after="40" w:before="80"/>
+      </w:pPr>
+      <w:r>
+        <w:rPr>
+          <w:b/>
+          <w:sz w:val="21"/>
+        </w:rPr>
+        <w:t xml:space="preserve">Table 2: </w:t>
+      </w:r>
+      <w:r>
+        <w:rPr>
+          <w:i/>
+          <w:sz w:val="21"/>
+        </w:rPr>
+        <w:t>The three sections of every .l and .y file I used</w:t>
+      </w:r>
+    </w:p>
+    <w:tbl>
+      <w:tblPr>
+        <w:tblStyle w:val="TableGrid"/>
+        <w:tblW w:type="auto" w:w="0"/>
+        <w:jc w:val="center"/>
+        <w:tblLook w:firstColumn="1" w:firstRow="1" w:lastColumn="0" w:lastRow="0" w:noHBand="0" w:noVBand="1" w:val="04A0"/>
+      </w:tblPr>
+      <w:tblGrid>
+        <w:gridCol w:w="2409"/>
+        <w:gridCol w:w="2409"/>
+        <w:gridCol w:w="2409"/>
+        <w:gridCol w:w="2409"/>
+      </w:tblGrid>
+      <w:tr>
+        <w:tc>
+          <w:tcPr>
+            <w:tcW w:type="dxa" w:w="1587"/>
+            <w:shd w:val="clear" w:color="auto" w:fill="DCE6F1"/>
+          </w:tcPr>
+          <w:p>
+            <w:r/>
+            <w:r>
+              <w:rPr>
+                <w:b/>
+                <w:sz w:val="19"/>
+              </w:rPr>
+              <w:t>File</w:t>
+            </w:r>
+          </w:p>
+        </w:tc>
+        <w:tc>
+          <w:tcPr>
+            <w:tcW w:type="dxa" w:w="2948"/>
+            <w:shd w:val="clear" w:color="auto" w:fill="DCE6F1"/>
+          </w:tcPr>
+          <w:p>
+            <w:r/>
+            <w:r>
+              <w:rPr>
+                <w:b/>
+                <w:sz w:val="19"/>
+              </w:rPr>
+              <w:t>Definitions / declarations</w:t>
+            </w:r>
+          </w:p>
+        </w:tc>
+        <w:tc>
+          <w:tcPr>
+            <w:tcW w:type="dxa" w:w="2721"/>
+            <w:shd w:val="clear" w:color="auto" w:fill="DCE6F1"/>
+          </w:tcPr>
+          <w:p>
+            <w:r/>
+            <w:r>
+              <w:rPr>
+                <w:b/>
+                <w:sz w:val="19"/>
+              </w:rPr>
+              <w:t>Rules</w:t>
+            </w:r>
+          </w:p>
+        </w:tc>
+        <w:tc>
+          <w:tcPr>
+            <w:tcW w:type="dxa" w:w="2381"/>
+            <w:shd w:val="clear" w:color="auto" w:fill="DCE6F1"/>
+          </w:tcPr>
+          <w:p>
+            <w:r/>
+            <w:r>
+              <w:rPr>
+                <w:b/>
+                <w:sz w:val="19"/>
+              </w:rPr>
+              <w:t>User code</w:t>
+            </w:r>
+          </w:p>
+        </w:tc>
+      </w:tr>
+      <w:tr>
+        <w:tc>
+          <w:tcPr>
+            <w:tcW w:type="dxa" w:w="1587"/>
+          </w:tcPr>
+          <w:p>
+            <w:pPr>
+              <w:spacing w:after="0"/>
+            </w:pPr>
+            <w:r>
+              <w:rPr>
+                <w:sz w:val="19"/>
+              </w:rPr>
+            </w:r>
+            <w:r>
+              <w:rPr>
+                <w:sz w:val="19"/>
+              </w:rPr>
+              <w:t>ex1.l</w:t>
+            </w:r>
+          </w:p>
+        </w:tc>
+        <w:tc>
+          <w:tcPr>
+            <w:tcW w:type="dxa" w:w="2948"/>
+          </w:tcPr>
+          <w:p>
+            <w:pPr>
+              <w:spacing w:after="0"/>
+            </w:pPr>
+            <w:r>
+              <w:rPr>
+                <w:sz w:val="19"/>
+              </w:rPr>
+            </w:r>
+            <w:r>
+              <w:rPr>
+                <w:sz w:val="19"/>
+              </w:rPr>
+              <w:t>empty</w:t>
+            </w:r>
+          </w:p>
+        </w:tc>
+        <w:tc>
+          <w:tcPr>
+            <w:tcW w:type="dxa" w:w="2721"/>
+          </w:tcPr>
+          <w:p>
+            <w:pPr>
+              <w:spacing w:after="0"/>
+            </w:pPr>
+            <w:r>
+              <w:rPr>
+                <w:sz w:val="19"/>
+              </w:rPr>
+            </w:r>
+            <w:r>
+              <w:rPr>
+                <w:rFonts w:ascii="Courier New" w:hAnsi="Courier New"/>
+                <w:sz w:val="19"/>
+              </w:rPr>
+              <w:t>.</w:t>
+            </w:r>
+            <w:r>
+              <w:rPr>
+                <w:sz w:val="19"/>
+              </w:rPr>
+              <w:t xml:space="preserve"> and </w:t>
+            </w:r>
+            <w:r>
+              <w:rPr>
+                <w:rFonts w:ascii="Courier New" w:hAnsi="Courier New"/>
+                <w:sz w:val="19"/>
+              </w:rPr>
+              <w:t>\n</w:t>
+            </w:r>
+            <w:r>
+              <w:rPr>
+                <w:sz w:val="19"/>
+              </w:rPr>
+              <w:t xml:space="preserve"> with ECHO</w:t>
+            </w:r>
+          </w:p>
+        </w:tc>
+        <w:tc>
+          <w:tcPr>
+            <w:tcW w:type="dxa" w:w="2381"/>
+          </w:tcPr>
+          <w:p>
+            <w:pPr>
+              <w:spacing w:after="0"/>
+            </w:pPr>
+            <w:r>
+              <w:rPr>
+                <w:sz w:val="19"/>
+              </w:rPr>
+            </w:r>
+            <w:r>
+              <w:rPr>
+                <w:sz w:val="19"/>
+              </w:rPr>
+              <w:t>yywrap, main</w:t>
+            </w:r>
+          </w:p>
+        </w:tc>
+      </w:tr>
+      <w:tr>
+        <w:tc>
+          <w:tcPr>
+            <w:tcW w:type="dxa" w:w="1587"/>
+          </w:tcPr>
+          <w:p>
+            <w:pPr>
+              <w:spacing w:after="0"/>
+            </w:pPr>
+            <w:r>
+              <w:rPr>
+                <w:sz w:val="19"/>
+              </w:rPr>
+            </w:r>
+            <w:r>
+              <w:rPr>
+                <w:sz w:val="19"/>
+              </w:rPr>
+              <w:t>ex2.l</w:t>
+            </w:r>
+          </w:p>
+        </w:tc>
+        <w:tc>
+          <w:tcPr>
+            <w:tcW w:type="dxa" w:w="2948"/>
+          </w:tcPr>
+          <w:p>
+            <w:pPr>
+              <w:spacing w:after="0"/>
+            </w:pPr>
+            <w:r>
+              <w:rPr>
+                <w:sz w:val="19"/>
+              </w:rPr>
+            </w:r>
+            <w:r>
+              <w:rPr>
+                <w:sz w:val="19"/>
+              </w:rPr>
+              <w:t>%{ int lineno; %}</w:t>
+            </w:r>
+          </w:p>
+        </w:tc>
+        <w:tc>
+          <w:tcPr>
+            <w:tcW w:type="dxa" w:w="2721"/>
+          </w:tcPr>
+          <w:p>
+            <w:pPr>
+              <w:spacing w:after="0"/>
+            </w:pPr>
+            <w:r>
+              <w:rPr>
+                <w:sz w:val="19"/>
+              </w:rPr>
+            </w:r>
+            <w:r>
+              <w:rPr>
+                <w:rFonts w:ascii="Courier New" w:hAnsi="Courier New"/>
+                <w:sz w:val="19"/>
+              </w:rPr>
+              <w:t>^(.*)\n</w:t>
+            </w:r>
+            <w:r>
+              <w:rPr>
+                <w:sz w:val="19"/>
+              </w:rPr>
+              <w:t xml:space="preserve"> prints a numbered line</w:t>
+            </w:r>
+          </w:p>
+        </w:tc>
+        <w:tc>
+          <w:tcPr>
+            <w:tcW w:type="dxa" w:w="2381"/>
+          </w:tcPr>
+          <w:p>
+            <w:pPr>
+              <w:spacing w:after="0"/>
+            </w:pPr>
+            <w:r>
+              <w:rPr>
+                <w:sz w:val="19"/>
+              </w:rPr>
+            </w:r>
+            <w:r>
+              <w:rPr>
+                <w:sz w:val="19"/>
+              </w:rPr>
+              <w:t>main opens argv[1] as yyin</w:t>
+            </w:r>
+          </w:p>
+        </w:tc>
+      </w:tr>
+      <w:tr>
+        <w:tc>
+          <w:tcPr>
+            <w:tcW w:type="dxa" w:w="1587"/>
+          </w:tcPr>
+          <w:p>
+            <w:pPr>
+              <w:spacing w:after="0"/>
+            </w:pPr>
+            <w:r>
+              <w:rPr>
+                <w:sz w:val="19"/>
+              </w:rPr>
+            </w:r>
+            <w:r>
+              <w:rPr>
+                <w:sz w:val="19"/>
+              </w:rPr>
+              <w:t>ex3.l, ex3mod.l</w:t>
+            </w:r>
+          </w:p>
+        </w:tc>
+        <w:tc>
+          <w:tcPr>
+            <w:tcW w:type="dxa" w:w="2948"/>
+          </w:tcPr>
+          <w:p>
+            <w:pPr>
+              <w:spacing w:after="0"/>
+            </w:pPr>
+            <w:r>
+              <w:rPr>
+                <w:sz w:val="19"/>
+              </w:rPr>
+            </w:r>
+            <w:r>
+              <w:rPr>
+                <w:sz w:val="19"/>
+              </w:rPr>
+              <w:t>named patterns digit and letter, int count</w:t>
+            </w:r>
+          </w:p>
+        </w:tc>
+        <w:tc>
+          <w:tcPr>
+            <w:tcW w:type="dxa" w:w="2721"/>
+          </w:tcPr>
+          <w:p>
+            <w:pPr>
+              <w:spacing w:after="0"/>
+            </w:pPr>
+            <w:r>
+              <w:rPr>
+                <w:sz w:val="19"/>
+              </w:rPr>
+            </w:r>
+            <w:r>
+              <w:rPr>
+                <w:sz w:val="19"/>
+              </w:rPr>
+              <w:t>identifier pattern does count++</w:t>
+            </w:r>
+          </w:p>
+        </w:tc>
+        <w:tc>
+          <w:tcPr>
+            <w:tcW w:type="dxa" w:w="2381"/>
+          </w:tcPr>
+          <w:p>
+            <w:pPr>
+              <w:spacing w:after="0"/>
+            </w:pPr>
+            <w:r>
+              <w:rPr>
+                <w:sz w:val="19"/>
+              </w:rPr>
+            </w:r>
+            <w:r>
+              <w:rPr>
+                <w:sz w:val="19"/>
+              </w:rPr>
+              <w:t>main prints count</w:t>
+            </w:r>
+          </w:p>
+        </w:tc>
+      </w:tr>
+      <w:tr>
+        <w:tc>
+          <w:tcPr>
+            <w:tcW w:type="dxa" w:w="1587"/>
+          </w:tcPr>
+          <w:p>
+            <w:pPr>
+              <w:spacing w:after="0"/>
+            </w:pPr>
+            <w:r>
+              <w:rPr>
+                <w:sz w:val="19"/>
+              </w:rPr>
+            </w:r>
+            <w:r>
+              <w:rPr>
+                <w:sz w:val="19"/>
+              </w:rPr>
+              <w:t>ex4.l</w:t>
+            </w:r>
+          </w:p>
+        </w:tc>
+        <w:tc>
+          <w:tcPr>
+            <w:tcW w:type="dxa" w:w="2948"/>
+          </w:tcPr>
+          <w:p>
+            <w:pPr>
+              <w:spacing w:after="0"/>
+            </w:pPr>
+            <w:r>
+              <w:rPr>
+                <w:sz w:val="19"/>
+              </w:rPr>
+            </w:r>
+            <w:r>
+              <w:rPr>
+                <w:sz w:val="19"/>
+              </w:rPr>
+              <w:t>indented line declaring three counters</w:t>
+            </w:r>
+          </w:p>
+        </w:tc>
+        <w:tc>
+          <w:tcPr>
+            <w:tcW w:type="dxa" w:w="2721"/>
+          </w:tcPr>
+          <w:p>
+            <w:pPr>
+              <w:spacing w:after="0"/>
+            </w:pPr>
+            <w:r>
+              <w:rPr>
+                <w:sz w:val="19"/>
+              </w:rPr>
+            </w:r>
+            <w:r>
+              <w:rPr>
+                <w:sz w:val="19"/>
+              </w:rPr>
+              <w:t>newline, word and other character</w:t>
+            </w:r>
+          </w:p>
+        </w:tc>
+        <w:tc>
+          <w:tcPr>
+            <w:tcW w:type="dxa" w:w="2381"/>
+          </w:tcPr>
+          <w:p>
+            <w:pPr>
+              <w:spacing w:after="0"/>
+            </w:pPr>
+            <w:r>
+              <w:rPr>
+                <w:sz w:val="19"/>
+              </w:rPr>
+            </w:r>
+            <w:r>
+              <w:rPr>
+                <w:sz w:val="19"/>
+              </w:rPr>
+              <w:t>main prints the counts</w:t>
+            </w:r>
+          </w:p>
+        </w:tc>
+      </w:tr>
+      <w:tr>
+        <w:tc>
+          <w:tcPr>
+            <w:tcW w:type="dxa" w:w="1587"/>
+          </w:tcPr>
+          <w:p>
+            <w:pPr>
+              <w:spacing w:after="0"/>
+            </w:pPr>
+            <w:r>
+              <w:rPr>
+                <w:sz w:val="19"/>
+              </w:rPr>
+            </w:r>
+            <w:r>
+              <w:rPr>
+                <w:sz w:val="19"/>
+              </w:rPr>
+              <w:t>calc1.l</w:t>
+            </w:r>
+          </w:p>
+        </w:tc>
+        <w:tc>
+          <w:tcPr>
+            <w:tcW w:type="dxa" w:w="2948"/>
+          </w:tcPr>
+          <w:p>
+            <w:pPr>
+              <w:spacing w:after="0"/>
+            </w:pPr>
+            <w:r>
+              <w:rPr>
+                <w:sz w:val="19"/>
+              </w:rPr>
+            </w:r>
+            <w:r>
+              <w:rPr>
+                <w:sz w:val="19"/>
+              </w:rPr>
+              <w:t>includes, yyerror prototype, y.tab.h</w:t>
+            </w:r>
+          </w:p>
+        </w:tc>
+        <w:tc>
+          <w:tcPr>
+            <w:tcW w:type="dxa" w:w="2721"/>
+          </w:tcPr>
+          <w:p>
+            <w:pPr>
+              <w:spacing w:after="0"/>
+            </w:pPr>
+            <w:r>
+              <w:rPr>
+                <w:sz w:val="19"/>
+              </w:rPr>
+            </w:r>
+            <w:r>
+              <w:rPr>
+                <w:sz w:val="19"/>
+              </w:rPr>
+              <w:t>number, + - newline, whitespace, error</w:t>
+            </w:r>
+          </w:p>
+        </w:tc>
+        <w:tc>
+          <w:tcPr>
+            <w:tcW w:type="dxa" w:w="2381"/>
+          </w:tcPr>
+          <w:p>
+            <w:pPr>
+              <w:spacing w:after="0"/>
+            </w:pPr>
+            <w:r>
+              <w:rPr>
+                <w:sz w:val="19"/>
+              </w:rPr>
+            </w:r>
+            <w:r>
+              <w:rPr>
+                <w:sz w:val="19"/>
+              </w:rPr>
+              <w:t>yywrap</w:t>
+            </w:r>
+          </w:p>
+        </w:tc>
+      </w:tr>
+      <w:tr>
+        <w:tc>
+          <w:tcPr>
+            <w:tcW w:type="dxa" w:w="1587"/>
+          </w:tcPr>
+          <w:p>
+            <w:pPr>
+              <w:spacing w:after="0"/>
+            </w:pPr>
+            <w:r>
+              <w:rPr>
+                <w:sz w:val="19"/>
+              </w:rPr>
+            </w:r>
+            <w:r>
+              <w:rPr>
+                <w:sz w:val="19"/>
+              </w:rPr>
+              <w:t>calc1.y</w:t>
+            </w:r>
+          </w:p>
+        </w:tc>
+        <w:tc>
+          <w:tcPr>
+            <w:tcW w:type="dxa" w:w="2948"/>
+          </w:tcPr>
+          <w:p>
+            <w:pPr>
+              <w:spacing w:after="0"/>
+            </w:pPr>
+            <w:r>
+              <w:rPr>
+                <w:sz w:val="19"/>
+              </w:rPr>
+            </w:r>
+            <w:r>
+              <w:rPr>
+                <w:sz w:val="19"/>
+              </w:rPr>
+              <w:t>C prologue, %token INTEGER</w:t>
+            </w:r>
+          </w:p>
+        </w:tc>
+        <w:tc>
+          <w:tcPr>
+            <w:tcW w:type="dxa" w:w="2721"/>
+          </w:tcPr>
+          <w:p>
+            <w:pPr>
+              <w:spacing w:after="0"/>
+            </w:pPr>
+            <w:r>
+              <w:rPr>
+                <w:sz w:val="19"/>
+              </w:rPr>
+            </w:r>
+            <w:r>
+              <w:rPr>
+                <w:sz w:val="19"/>
+              </w:rPr>
+              <w:t>program and expr</w:t>
+            </w:r>
+          </w:p>
+        </w:tc>
+        <w:tc>
+          <w:tcPr>
+            <w:tcW w:type="dxa" w:w="2381"/>
+          </w:tcPr>
+          <w:p>
+            <w:pPr>
+              <w:spacing w:after="0"/>
+            </w:pPr>
+            <w:r>
+              <w:rPr>
+                <w:sz w:val="19"/>
+              </w:rPr>
+            </w:r>
+            <w:r>
+              <w:rPr>
+                <w:sz w:val="19"/>
+              </w:rPr>
+              <w:t>yyerror, main</w:t>
+            </w:r>
+          </w:p>
+        </w:tc>
+      </w:tr>
+      <w:tr>
+        <w:tc>
+          <w:tcPr>
+            <w:tcW w:type="dxa" w:w="1587"/>
+          </w:tcPr>
+          <w:p>
+            <w:pPr>
+              <w:spacing w:after="0"/>
+            </w:pPr>
+            <w:r>
+              <w:rPr>
+                <w:sz w:val="19"/>
+              </w:rPr>
+            </w:r>
+            <w:r>
+              <w:rPr>
+                <w:sz w:val="19"/>
+              </w:rPr>
+              <w:t>calc2.l</w:t>
+            </w:r>
+          </w:p>
+        </w:tc>
+        <w:tc>
+          <w:tcPr>
+            <w:tcW w:type="dxa" w:w="2948"/>
+          </w:tcPr>
+          <w:p>
+            <w:pPr>
+              <w:spacing w:after="0"/>
+            </w:pPr>
+            <w:r>
+              <w:rPr>
+                <w:sz w:val="19"/>
+              </w:rPr>
+            </w:r>
+            <w:r>
+              <w:rPr>
+                <w:sz w:val="19"/>
+              </w:rPr>
+              <w:t>includes, y.tab.h</w:t>
+            </w:r>
+          </w:p>
+        </w:tc>
+        <w:tc>
+          <w:tcPr>
+            <w:tcW w:type="dxa" w:w="2721"/>
+          </w:tcPr>
+          <w:p>
+            <w:pPr>
+              <w:spacing w:after="0"/>
+            </w:pPr>
+            <w:r>
+              <w:rPr>
+                <w:sz w:val="19"/>
+              </w:rPr>
+            </w:r>
+            <w:r>
+              <w:rPr>
+                <w:sz w:val="19"/>
+              </w:rPr>
+              <w:t>variable, number, operators, whitespace, error</w:t>
+            </w:r>
+          </w:p>
+        </w:tc>
+        <w:tc>
+          <w:tcPr>
+            <w:tcW w:type="dxa" w:w="2381"/>
+          </w:tcPr>
+          <w:p>
+            <w:pPr>
+              <w:spacing w:after="0"/>
+            </w:pPr>
+            <w:r>
+              <w:rPr>
+                <w:sz w:val="19"/>
+              </w:rPr>
+            </w:r>
+            <w:r>
+              <w:rPr>
+                <w:sz w:val="19"/>
+              </w:rPr>
+              <w:t>yywrap</w:t>
+            </w:r>
+          </w:p>
+        </w:tc>
+      </w:tr>
+      <w:tr>
+        <w:tc>
+          <w:tcPr>
+            <w:tcW w:type="dxa" w:w="1587"/>
+          </w:tcPr>
+          <w:p>
+            <w:pPr>
+              <w:spacing w:after="0"/>
+            </w:pPr>
+            <w:r>
+              <w:rPr>
+                <w:sz w:val="19"/>
+              </w:rPr>
+            </w:r>
+            <w:r>
+              <w:rPr>
+                <w:sz w:val="19"/>
+              </w:rPr>
+              <w:t>calc2.y</w:t>
+            </w:r>
+          </w:p>
+        </w:tc>
+        <w:tc>
+          <w:tcPr>
+            <w:tcW w:type="dxa" w:w="2948"/>
+          </w:tcPr>
+          <w:p>
+            <w:pPr>
+              <w:spacing w:after="0"/>
+            </w:pPr>
+            <w:r>
+              <w:rPr>
+                <w:sz w:val="19"/>
+              </w:rPr>
+            </w:r>
+            <w:r>
+              <w:rPr>
+                <w:sz w:val="19"/>
+              </w:rPr>
+              <w:t>prologue with sym[26], %token, two %left lines</w:t>
+            </w:r>
+          </w:p>
+        </w:tc>
+        <w:tc>
+          <w:tcPr>
+            <w:tcW w:type="dxa" w:w="2721"/>
+          </w:tcPr>
+          <w:p>
+            <w:pPr>
+              <w:spacing w:after="0"/>
+            </w:pPr>
+            <w:r>
+              <w:rPr>
+                <w:sz w:val="19"/>
+              </w:rPr>
+            </w:r>
+            <w:r>
+              <w:rPr>
+                <w:sz w:val="19"/>
+              </w:rPr>
+              <w:t>program, statement, expr</w:t>
+            </w:r>
+          </w:p>
+        </w:tc>
+        <w:tc>
+          <w:tcPr>
+            <w:tcW w:type="dxa" w:w="2381"/>
+          </w:tcPr>
+          <w:p>
+            <w:pPr>
+              <w:spacing w:after="0"/>
+            </w:pPr>
+            <w:r>
+              <w:rPr>
+                <w:sz w:val="19"/>
+              </w:rPr>
+            </w:r>
+            <w:r>
+              <w:rPr>
+                <w:sz w:val="19"/>
+              </w:rPr>
+              <w:t>yyerror, main</w:t>
+            </w:r>
+          </w:p>
+        </w:tc>
+      </w:tr>
+      <w:tr>
+        <w:tc>
+          <w:tcPr>
+            <w:tcW w:type="dxa" w:w="1587"/>
+          </w:tcPr>
+          <w:p>
+            <w:pPr>
+              <w:spacing w:after="0"/>
+            </w:pPr>
+            <w:r>
+              <w:rPr>
+                <w:sz w:val="19"/>
+              </w:rPr>
+            </w:r>
+            <w:r>
+              <w:rPr>
+                <w:sz w:val="19"/>
+              </w:rPr>
+              <w:t>calc3.l</w:t>
+            </w:r>
+          </w:p>
+        </w:tc>
+        <w:tc>
+          <w:tcPr>
+            <w:tcW w:type="dxa" w:w="2948"/>
+          </w:tcPr>
+          <w:p>
+            <w:pPr>
+              <w:spacing w:after="0"/>
+            </w:pPr>
+            <w:r>
+              <w:rPr>
+                <w:sz w:val="19"/>
+              </w:rPr>
+            </w:r>
+            <w:r>
+              <w:rPr>
+                <w:sz w:val="19"/>
+              </w:rPr>
+              <w:t>includes calc3.h and y.tab.h</w:t>
+            </w:r>
+          </w:p>
+        </w:tc>
+        <w:tc>
+          <w:tcPr>
+            <w:tcW w:type="dxa" w:w="2721"/>
+          </w:tcPr>
+          <w:p>
+            <w:pPr>
+              <w:spacing w:after="0"/>
+            </w:pPr>
+            <w:r>
+              <w:rPr>
+                <w:sz w:val="19"/>
+              </w:rPr>
+            </w:r>
+            <w:r>
+              <w:rPr>
+                <w:sz w:val="19"/>
+              </w:rPr>
+              <w:t>variable, numbers, operators, keywords, whitespace, error</w:t>
+            </w:r>
+          </w:p>
+        </w:tc>
+        <w:tc>
+          <w:tcPr>
+            <w:tcW w:type="dxa" w:w="2381"/>
+          </w:tcPr>
+          <w:p>
+            <w:pPr>
+              <w:spacing w:after="0"/>
+            </w:pPr>
+            <w:r>
+              <w:rPr>
+                <w:sz w:val="19"/>
+              </w:rPr>
+            </w:r>
+            <w:r>
+              <w:rPr>
+                <w:sz w:val="19"/>
+              </w:rPr>
+              <w:t>yywrap</w:t>
+            </w:r>
+          </w:p>
+        </w:tc>
+      </w:tr>
+      <w:tr>
+        <w:tc>
+          <w:tcPr>
+            <w:tcW w:type="dxa" w:w="1587"/>
+          </w:tcPr>
+          <w:p>
+            <w:pPr>
+              <w:spacing w:after="0"/>
+            </w:pPr>
+            <w:r>
+              <w:rPr>
+                <w:sz w:val="19"/>
+              </w:rPr>
+            </w:r>
+            <w:r>
+              <w:rPr>
+                <w:sz w:val="19"/>
+              </w:rPr>
+              <w:t>calc3.y</w:t>
+            </w:r>
+          </w:p>
+        </w:tc>
+        <w:tc>
+          <w:tcPr>
+            <w:tcW w:type="dxa" w:w="2948"/>
+          </w:tcPr>
+          <w:p>
+            <w:pPr>
+              <w:spacing w:after="0"/>
+            </w:pPr>
+            <w:r>
+              <w:rPr>
+                <w:sz w:val="19"/>
+              </w:rPr>
+            </w:r>
+            <w:r>
+              <w:rPr>
+                <w:sz w:val="19"/>
+              </w:rPr>
+              <w:t>prototypes, sym[26], %union, %token, %nonassoc, %left, %type</w:t>
+            </w:r>
+          </w:p>
+        </w:tc>
+        <w:tc>
+          <w:tcPr>
+            <w:tcW w:type="dxa" w:w="2721"/>
+          </w:tcPr>
+          <w:p>
+            <w:pPr>
+              <w:spacing w:after="0"/>
+            </w:pPr>
+            <w:r>
+              <w:rPr>
+                <w:sz w:val="19"/>
+              </w:rPr>
+            </w:r>
+            <w:r>
+              <w:rPr>
+                <w:sz w:val="19"/>
+              </w:rPr>
+              <w:t>program, function, stmt, stmt_list, expr</w:t>
+            </w:r>
+          </w:p>
+        </w:tc>
+        <w:tc>
+          <w:tcPr>
+            <w:tcW w:type="dxa" w:w="2381"/>
+          </w:tcPr>
+          <w:p>
+            <w:pPr>
+              <w:spacing w:after="0"/>
+            </w:pPr>
+            <w:r>
+              <w:rPr>
+                <w:sz w:val="19"/>
+              </w:rPr>
+            </w:r>
+            <w:r>
+              <w:rPr>
+                <w:sz w:val="19"/>
+              </w:rPr>
+              <w:t>con, id, opr, freeNode, yyerror, main</w:t>
+            </w:r>
+          </w:p>
+        </w:tc>
+      </w:tr>
+      <w:tr>
+        <w:tc>
+          <w:tcPr>
+            <w:tcW w:type="dxa" w:w="1587"/>
+          </w:tcPr>
+          <w:p>
+            <w:pPr>
+              <w:spacing w:after="0"/>
+            </w:pPr>
+            <w:r>
+              <w:rPr>
+                <w:sz w:val="19"/>
+              </w:rPr>
+            </w:r>
+            <w:r>
+              <w:rPr>
+                <w:sz w:val="19"/>
+              </w:rPr>
+              <w:t>calc4.l, calc4.y</w:t>
+            </w:r>
+          </w:p>
+        </w:tc>
+        <w:tc>
+          <w:tcPr>
+            <w:tcW w:type="dxa" w:w="2948"/>
+          </w:tcPr>
+          <w:p>
+            <w:pPr>
+              <w:spacing w:after="0"/>
+            </w:pPr>
+            <w:r>
+              <w:rPr>
+                <w:sz w:val="19"/>
+              </w:rPr>
+            </w:r>
+            <w:r>
+              <w:rPr>
+                <w:sz w:val="19"/>
+              </w:rPr>
+              <w:t>same as calc3 plus %option yylineno, DO FOR, '%' '^', symEntry table</w:t>
+            </w:r>
+          </w:p>
+        </w:tc>
+        <w:tc>
+          <w:tcPr>
+            <w:tcW w:type="dxa" w:w="2721"/>
+          </w:tcPr>
+          <w:p>
+            <w:pPr>
+              <w:spacing w:after="0"/>
+            </w:pPr>
+            <w:r>
+              <w:rPr>
+                <w:sz w:val="19"/>
+              </w:rPr>
+            </w:r>
+            <w:r>
+              <w:rPr>
+                <w:sz w:val="19"/>
+              </w:rPr>
+              <w:t>same as calc3 plus do, for, assign, % and ^</w:t>
+            </w:r>
+          </w:p>
+        </w:tc>
+        <w:tc>
+          <w:tcPr>
+            <w:tcW w:type="dxa" w:w="2381"/>
+          </w:tcPr>
+          <w:p>
+            <w:pPr>
+              <w:spacing w:after="0"/>
+            </w:pPr>
+            <w:r>
+              <w:rPr>
+                <w:sz w:val="19"/>
+              </w:rPr>
+            </w:r>
+            <w:r>
+              <w:rPr>
+                <w:sz w:val="19"/>
+              </w:rPr>
+              <w:t>same as calc3 plus lookup</w:t>
+            </w:r>
+          </w:p>
+        </w:tc>
+      </w:tr>
+    </w:tbl>
+    <w:p>
+      <w:pPr>
+        <w:spacing w:after="40"/>
+      </w:pPr>
+    </w:p>
+    <w:p>
+      <w:pPr>
         <w:pStyle w:val="Heading2"/>
       </w:pPr>
       <w:r>
@@ -1804,7 +2882,7 @@
             <w:r>
               <w:rPr>
                 <w:rFonts w:ascii="Courier New" w:hAnsi="Courier New" w:eastAsia="Courier New"/>
-                <w:sz w:val="18"/>
+                <w:sz w:val="17"/>
               </w:rPr>
               <w:t>%%</w:t>
               <w:br/>
@@ -1812,7 +2890,7 @@
             <w:r>
               <w:rPr>
                 <w:rFonts w:ascii="Courier New" w:hAnsi="Courier New" w:eastAsia="Courier New"/>
-                <w:sz w:val="18"/>
+                <w:sz w:val="17"/>
               </w:rPr>
               <w:t>.       ECHO;</w:t>
               <w:br/>
@@ -1820,7 +2898,7 @@
             <w:r>
               <w:rPr>
                 <w:rFonts w:ascii="Courier New" w:hAnsi="Courier New" w:eastAsia="Courier New"/>
-                <w:sz w:val="18"/>
+                <w:sz w:val="17"/>
               </w:rPr>
               <w:t>\n      ECHO;</w:t>
               <w:br/>
@@ -1828,7 +2906,7 @@
             <w:r>
               <w:rPr>
                 <w:rFonts w:ascii="Courier New" w:hAnsi="Courier New" w:eastAsia="Courier New"/>
-                <w:sz w:val="18"/>
+                <w:sz w:val="17"/>
               </w:rPr>
               <w:t>%%</w:t>
               <w:br/>
@@ -1836,7 +2914,7 @@
             <w:r>
               <w:rPr>
                 <w:rFonts w:ascii="Courier New" w:hAnsi="Courier New" w:eastAsia="Courier New"/>
-                <w:sz w:val="18"/>
+                <w:sz w:val="17"/>
               </w:rPr>
               <w:t>int yywrap(void) {</w:t>
               <w:br/>
@@ -1844,7 +2922,7 @@
             <w:r>
               <w:rPr>
                 <w:rFonts w:ascii="Courier New" w:hAnsi="Courier New" w:eastAsia="Courier New"/>
-                <w:sz w:val="18"/>
+                <w:sz w:val="17"/>
               </w:rPr>
               <w:t xml:space="preserve">    return 1;</w:t>
               <w:br/>
@@ -1852,7 +2930,7 @@
             <w:r>
               <w:rPr>
                 <w:rFonts w:ascii="Courier New" w:hAnsi="Courier New" w:eastAsia="Courier New"/>
-                <w:sz w:val="18"/>
+                <w:sz w:val="17"/>
               </w:rPr>
               <w:t>}</w:t>
               <w:br/>
@@ -1860,14 +2938,14 @@
             <w:r>
               <w:rPr>
                 <w:rFonts w:ascii="Courier New" w:hAnsi="Courier New" w:eastAsia="Courier New"/>
-                <w:sz w:val="18"/>
+                <w:sz w:val="17"/>
               </w:rPr>
               <w:br/>
             </w:r>
             <w:r>
               <w:rPr>
                 <w:rFonts w:ascii="Courier New" w:hAnsi="Courier New" w:eastAsia="Courier New"/>
-                <w:sz w:val="18"/>
+                <w:sz w:val="17"/>
               </w:rPr>
               <w:t>int main(void) {</w:t>
               <w:br/>
@@ -1875,7 +2953,7 @@
             <w:r>
               <w:rPr>
                 <w:rFonts w:ascii="Courier New" w:hAnsi="Courier New" w:eastAsia="Courier New"/>
-                <w:sz w:val="18"/>
+                <w:sz w:val="17"/>
               </w:rPr>
               <w:t xml:space="preserve">    yylex();</w:t>
               <w:br/>
@@ -1883,7 +2961,7 @@
             <w:r>
               <w:rPr>
                 <w:rFonts w:ascii="Courier New" w:hAnsi="Courier New" w:eastAsia="Courier New"/>
-                <w:sz w:val="18"/>
+                <w:sz w:val="17"/>
               </w:rPr>
               <w:t xml:space="preserve">    return 0;</w:t>
               <w:br/>
@@ -1891,7 +2969,7 @@
             <w:r>
               <w:rPr>
                 <w:rFonts w:ascii="Courier New" w:hAnsi="Courier New" w:eastAsia="Courier New"/>
-                <w:sz w:val="18"/>
+                <w:sz w:val="17"/>
               </w:rPr>
               <w:t>}</w:t>
             </w:r>
@@ -2046,7 +3124,7 @@
             <w:r>
               <w:rPr>
                 <w:rFonts w:ascii="Courier New" w:hAnsi="Courier New" w:eastAsia="Courier New"/>
-                <w:sz w:val="18"/>
+                <w:sz w:val="17"/>
               </w:rPr>
               <w:t>%{</w:t>
               <w:br/>
@@ -2054,7 +3132,7 @@
             <w:r>
               <w:rPr>
                 <w:rFonts w:ascii="Courier New" w:hAnsi="Courier New" w:eastAsia="Courier New"/>
-                <w:sz w:val="18"/>
+                <w:sz w:val="17"/>
               </w:rPr>
               <w:t xml:space="preserve">    int lineno;</w:t>
               <w:br/>
@@ -2062,7 +3140,7 @@
             <w:r>
               <w:rPr>
                 <w:rFonts w:ascii="Courier New" w:hAnsi="Courier New" w:eastAsia="Courier New"/>
-                <w:sz w:val="18"/>
+                <w:sz w:val="17"/>
               </w:rPr>
               <w:t>%}</w:t>
               <w:br/>
@@ -2070,7 +3148,7 @@
             <w:r>
               <w:rPr>
                 <w:rFonts w:ascii="Courier New" w:hAnsi="Courier New" w:eastAsia="Courier New"/>
-                <w:sz w:val="18"/>
+                <w:sz w:val="17"/>
               </w:rPr>
               <w:t>%%</w:t>
               <w:br/>
@@ -2078,7 +3156,7 @@
             <w:r>
               <w:rPr>
                 <w:rFonts w:ascii="Courier New" w:hAnsi="Courier New" w:eastAsia="Courier New"/>
-                <w:sz w:val="18"/>
+                <w:sz w:val="17"/>
               </w:rPr>
               <w:t>^(.*)\n     printf("%4d\t%s", ++lineno, yytext);</w:t>
               <w:br/>
@@ -2086,7 +3164,7 @@
             <w:r>
               <w:rPr>
                 <w:rFonts w:ascii="Courier New" w:hAnsi="Courier New" w:eastAsia="Courier New"/>
-                <w:sz w:val="18"/>
+                <w:sz w:val="17"/>
               </w:rPr>
               <w:t>%%</w:t>
               <w:br/>
@@ -2094,7 +3172,7 @@
             <w:r>
               <w:rPr>
                 <w:rFonts w:ascii="Courier New" w:hAnsi="Courier New" w:eastAsia="Courier New"/>
-                <w:sz w:val="18"/>
+                <w:sz w:val="17"/>
               </w:rPr>
               <w:t>int main(int argc, char *argv[]) {</w:t>
               <w:br/>
@@ -2102,7 +3180,7 @@
             <w:r>
               <w:rPr>
                 <w:rFonts w:ascii="Courier New" w:hAnsi="Courier New" w:eastAsia="Courier New"/>
-                <w:sz w:val="18"/>
+                <w:sz w:val="17"/>
               </w:rPr>
               <w:t xml:space="preserve">    yyin = fopen(argv[1], "r");</w:t>
               <w:br/>
@@ -2110,7 +3188,7 @@
             <w:r>
               <w:rPr>
                 <w:rFonts w:ascii="Courier New" w:hAnsi="Courier New" w:eastAsia="Courier New"/>
-                <w:sz w:val="18"/>
+                <w:sz w:val="17"/>
               </w:rPr>
               <w:t xml:space="preserve">    yylex();</w:t>
               <w:br/>
@@ -2118,7 +3196,7 @@
             <w:r>
               <w:rPr>
                 <w:rFonts w:ascii="Courier New" w:hAnsi="Courier New" w:eastAsia="Courier New"/>
-                <w:sz w:val="18"/>
+                <w:sz w:val="17"/>
               </w:rPr>
               <w:t xml:space="preserve">    fclose(yyin);</w:t>
               <w:br/>
@@ -2126,7 +3204,7 @@
             <w:r>
               <w:rPr>
                 <w:rFonts w:ascii="Courier New" w:hAnsi="Courier New" w:eastAsia="Courier New"/>
-                <w:sz w:val="18"/>
+                <w:sz w:val="17"/>
               </w:rPr>
               <w:t xml:space="preserve">    return 0;</w:t>
               <w:br/>
@@ -2134,7 +3212,7 @@
             <w:r>
               <w:rPr>
                 <w:rFonts w:ascii="Courier New" w:hAnsi="Courier New" w:eastAsia="Courier New"/>
-                <w:sz w:val="18"/>
+                <w:sz w:val="17"/>
               </w:rPr>
               <w:t>}</w:t>
             </w:r>
@@ -2279,7 +3357,7 @@
             <w:r>
               <w:rPr>
                 <w:rFonts w:ascii="Courier New" w:hAnsi="Courier New" w:eastAsia="Courier New"/>
-                <w:sz w:val="18"/>
+                <w:sz w:val="17"/>
               </w:rPr>
               <w:t>digit       [0-9]</w:t>
               <w:br/>
@@ -2287,7 +3365,7 @@
             <w:r>
               <w:rPr>
                 <w:rFonts w:ascii="Courier New" w:hAnsi="Courier New" w:eastAsia="Courier New"/>
-                <w:sz w:val="18"/>
+                <w:sz w:val="17"/>
               </w:rPr>
               <w:t>letter      [A-Za-z]</w:t>
               <w:br/>
@@ -2295,7 +3373,7 @@
             <w:r>
               <w:rPr>
                 <w:rFonts w:ascii="Courier New" w:hAnsi="Courier New" w:eastAsia="Courier New"/>
-                <w:sz w:val="18"/>
+                <w:sz w:val="17"/>
               </w:rPr>
               <w:t>%{</w:t>
               <w:br/>
@@ -2303,7 +3381,7 @@
             <w:r>
               <w:rPr>
                 <w:rFonts w:ascii="Courier New" w:hAnsi="Courier New" w:eastAsia="Courier New"/>
-                <w:sz w:val="18"/>
+                <w:sz w:val="17"/>
               </w:rPr>
               <w:t xml:space="preserve">    int count;</w:t>
               <w:br/>
@@ -2311,7 +3389,7 @@
             <w:r>
               <w:rPr>
                 <w:rFonts w:ascii="Courier New" w:hAnsi="Courier New" w:eastAsia="Courier New"/>
-                <w:sz w:val="18"/>
+                <w:sz w:val="17"/>
               </w:rPr>
               <w:t>%}</w:t>
               <w:br/>
@@ -2319,7 +3397,7 @@
             <w:r>
               <w:rPr>
                 <w:rFonts w:ascii="Courier New" w:hAnsi="Courier New" w:eastAsia="Courier New"/>
-                <w:sz w:val="18"/>
+                <w:sz w:val="17"/>
               </w:rPr>
               <w:t>%%</w:t>
               <w:br/>
@@ -2327,7 +3405,7 @@
             <w:r>
               <w:rPr>
                 <w:rFonts w:ascii="Courier New" w:hAnsi="Courier New" w:eastAsia="Courier New"/>
-                <w:sz w:val="18"/>
+                <w:sz w:val="17"/>
               </w:rPr>
               <w:t>{letter}({letter}|{digit})*     count++;</w:t>
               <w:br/>
@@ -2335,7 +3413,7 @@
             <w:r>
               <w:rPr>
                 <w:rFonts w:ascii="Courier New" w:hAnsi="Courier New" w:eastAsia="Courier New"/>
-                <w:sz w:val="18"/>
+                <w:sz w:val="17"/>
               </w:rPr>
               <w:t>%%</w:t>
               <w:br/>
@@ -2343,7 +3421,7 @@
             <w:r>
               <w:rPr>
                 <w:rFonts w:ascii="Courier New" w:hAnsi="Courier New" w:eastAsia="Courier New"/>
-                <w:sz w:val="18"/>
+                <w:sz w:val="17"/>
               </w:rPr>
               <w:t>int main(void) {</w:t>
               <w:br/>
@@ -2351,7 +3429,7 @@
             <w:r>
               <w:rPr>
                 <w:rFonts w:ascii="Courier New" w:hAnsi="Courier New" w:eastAsia="Courier New"/>
-                <w:sz w:val="18"/>
+                <w:sz w:val="17"/>
               </w:rPr>
               <w:t xml:space="preserve">    yylex();</w:t>
               <w:br/>
@@ -2359,7 +3437,7 @@
             <w:r>
               <w:rPr>
                 <w:rFonts w:ascii="Courier New" w:hAnsi="Courier New" w:eastAsia="Courier New"/>
-                <w:sz w:val="18"/>
+                <w:sz w:val="17"/>
               </w:rPr>
               <w:t xml:space="preserve">    printf("number of identifiers = %d\n", count);</w:t>
               <w:br/>
@@ -2367,7 +3445,7 @@
             <w:r>
               <w:rPr>
                 <w:rFonts w:ascii="Courier New" w:hAnsi="Courier New" w:eastAsia="Courier New"/>
-                <w:sz w:val="18"/>
+                <w:sz w:val="17"/>
               </w:rPr>
               <w:t xml:space="preserve">    return 0;</w:t>
               <w:br/>
@@ -2375,7 +3453,7 @@
             <w:r>
               <w:rPr>
                 <w:rFonts w:ascii="Courier New" w:hAnsi="Courier New" w:eastAsia="Courier New"/>
-                <w:sz w:val="18"/>
+                <w:sz w:val="17"/>
               </w:rPr>
               <w:t>}</w:t>
             </w:r>
@@ -2510,7 +3588,7 @@
             <w:r>
               <w:rPr>
                 <w:rFonts w:ascii="Courier New" w:hAnsi="Courier New" w:eastAsia="Courier New"/>
-                <w:sz w:val="18"/>
+                <w:sz w:val="17"/>
               </w:rPr>
               <w:t xml:space="preserve">    int nchar, nword, nline;</w:t>
               <w:br/>
@@ -2518,7 +3596,7 @@
             <w:r>
               <w:rPr>
                 <w:rFonts w:ascii="Courier New" w:hAnsi="Courier New" w:eastAsia="Courier New"/>
-                <w:sz w:val="18"/>
+                <w:sz w:val="17"/>
               </w:rPr>
               <w:t>%%</w:t>
               <w:br/>
@@ -2526,7 +3604,7 @@
             <w:r>
               <w:rPr>
                 <w:rFonts w:ascii="Courier New" w:hAnsi="Courier New" w:eastAsia="Courier New"/>
-                <w:sz w:val="18"/>
+                <w:sz w:val="17"/>
               </w:rPr>
               <w:t>\n          { nline++; nchar++; }</w:t>
               <w:br/>
@@ -2534,7 +3612,7 @@
             <w:r>
               <w:rPr>
                 <w:rFonts w:ascii="Courier New" w:hAnsi="Courier New" w:eastAsia="Courier New"/>
-                <w:sz w:val="18"/>
+                <w:sz w:val="17"/>
               </w:rPr>
               <w:t>[^ \t\n]+   { nword++, nchar += yyleng; }</w:t>
               <w:br/>
@@ -2542,7 +3620,7 @@
             <w:r>
               <w:rPr>
                 <w:rFonts w:ascii="Courier New" w:hAnsi="Courier New" w:eastAsia="Courier New"/>
-                <w:sz w:val="18"/>
+                <w:sz w:val="17"/>
               </w:rPr>
               <w:t>.           { nchar++; }</w:t>
               <w:br/>
@@ -2550,7 +3628,7 @@
             <w:r>
               <w:rPr>
                 <w:rFonts w:ascii="Courier New" w:hAnsi="Courier New" w:eastAsia="Courier New"/>
-                <w:sz w:val="18"/>
+                <w:sz w:val="17"/>
               </w:rPr>
               <w:t>%%</w:t>
               <w:br/>
@@ -2558,7 +3636,7 @@
             <w:r>
               <w:rPr>
                 <w:rFonts w:ascii="Courier New" w:hAnsi="Courier New" w:eastAsia="Courier New"/>
-                <w:sz w:val="18"/>
+                <w:sz w:val="17"/>
               </w:rPr>
               <w:t>int main(void) {</w:t>
               <w:br/>
@@ -2566,7 +3644,7 @@
             <w:r>
               <w:rPr>
                 <w:rFonts w:ascii="Courier New" w:hAnsi="Courier New" w:eastAsia="Courier New"/>
-                <w:sz w:val="18"/>
+                <w:sz w:val="17"/>
               </w:rPr>
               <w:t xml:space="preserve">    yylex();</w:t>
               <w:br/>
@@ -2574,7 +3652,7 @@
             <w:r>
               <w:rPr>
                 <w:rFonts w:ascii="Courier New" w:hAnsi="Courier New" w:eastAsia="Courier New"/>
-                <w:sz w:val="18"/>
+                <w:sz w:val="17"/>
               </w:rPr>
               <w:t xml:space="preserve">    printf("%d\t%d\t%d\n", nchar, nword, nline);</w:t>
               <w:br/>
@@ -2582,7 +3660,7 @@
             <w:r>
               <w:rPr>
                 <w:rFonts w:ascii="Courier New" w:hAnsi="Courier New" w:eastAsia="Courier New"/>
-                <w:sz w:val="18"/>
+                <w:sz w:val="17"/>
               </w:rPr>
               <w:t xml:space="preserve">    return 0;</w:t>
               <w:br/>
@@ -2590,7 +3668,7 @@
             <w:r>
               <w:rPr>
                 <w:rFonts w:ascii="Courier New" w:hAnsi="Courier New" w:eastAsia="Courier New"/>
-                <w:sz w:val="18"/>
+                <w:sz w:val="17"/>
               </w:rPr>
               <w:t>}</w:t>
             </w:r>
@@ -2755,7 +3833,7 @@
             <w:r>
               <w:rPr>
                 <w:rFonts w:ascii="Courier New" w:hAnsi="Courier New" w:eastAsia="Courier New"/>
-                <w:sz w:val="18"/>
+                <w:sz w:val="17"/>
               </w:rPr>
               <w:t>$ diff ex3.l ex3mod.l</w:t>
               <w:br/>
@@ -2763,7 +3841,7 @@
             <w:r>
               <w:rPr>
                 <w:rFonts w:ascii="Courier New" w:hAnsi="Courier New" w:eastAsia="Courier New"/>
-                <w:sz w:val="18"/>
+                <w:sz w:val="17"/>
               </w:rPr>
               <w:t>2c2</w:t>
               <w:br/>
@@ -2771,7 +3849,7 @@
             <w:r>
               <w:rPr>
                 <w:rFonts w:ascii="Courier New" w:hAnsi="Courier New" w:eastAsia="Courier New"/>
-                <w:sz w:val="18"/>
+                <w:sz w:val="17"/>
               </w:rPr>
               <w:t>&lt; letter      [A-Za-z]</w:t>
               <w:br/>
@@ -2779,7 +3857,7 @@
             <w:r>
               <w:rPr>
                 <w:rFonts w:ascii="Courier New" w:hAnsi="Courier New" w:eastAsia="Courier New"/>
-                <w:sz w:val="18"/>
+                <w:sz w:val="17"/>
               </w:rPr>
               <w:t>---</w:t>
               <w:br/>
@@ -2787,7 +3865,7 @@
             <w:r>
               <w:rPr>
                 <w:rFonts w:ascii="Courier New" w:hAnsi="Courier New" w:eastAsia="Courier New"/>
-                <w:sz w:val="18"/>
+                <w:sz w:val="17"/>
               </w:rPr>
               <w:t>&gt; letter      [A-Za-z_]</w:t>
             </w:r>
@@ -2950,7 +4028,7 @@
             <w:r>
               <w:rPr>
                 <w:rFonts w:ascii="Courier New" w:hAnsi="Courier New" w:eastAsia="Courier New"/>
-                <w:sz w:val="18"/>
+                <w:sz w:val="17"/>
               </w:rPr>
               <w:t>%{</w:t>
               <w:br/>
@@ -2958,7 +4036,7 @@
             <w:r>
               <w:rPr>
                 <w:rFonts w:ascii="Courier New" w:hAnsi="Courier New" w:eastAsia="Courier New"/>
-                <w:sz w:val="18"/>
+                <w:sz w:val="17"/>
               </w:rPr>
               <w:t xml:space="preserve">    #include &lt;stdlib.h&gt;</w:t>
               <w:br/>
@@ -2966,7 +4044,7 @@
             <w:r>
               <w:rPr>
                 <w:rFonts w:ascii="Courier New" w:hAnsi="Courier New" w:eastAsia="Courier New"/>
-                <w:sz w:val="18"/>
+                <w:sz w:val="17"/>
               </w:rPr>
               <w:t xml:space="preserve">    void yyerror(char *);</w:t>
               <w:br/>
@@ -2974,7 +4052,7 @@
             <w:r>
               <w:rPr>
                 <w:rFonts w:ascii="Courier New" w:hAnsi="Courier New" w:eastAsia="Courier New"/>
-                <w:sz w:val="18"/>
+                <w:sz w:val="17"/>
               </w:rPr>
               <w:t xml:space="preserve">    #include "y.tab.h"</w:t>
               <w:br/>
@@ -2982,7 +4060,7 @@
             <w:r>
               <w:rPr>
                 <w:rFonts w:ascii="Courier New" w:hAnsi="Courier New" w:eastAsia="Courier New"/>
-                <w:sz w:val="18"/>
+                <w:sz w:val="17"/>
               </w:rPr>
               <w:t>%}</w:t>
               <w:br/>
@@ -2990,14 +4068,14 @@
             <w:r>
               <w:rPr>
                 <w:rFonts w:ascii="Courier New" w:hAnsi="Courier New" w:eastAsia="Courier New"/>
-                <w:sz w:val="18"/>
+                <w:sz w:val="17"/>
               </w:rPr>
               <w:br/>
             </w:r>
             <w:r>
               <w:rPr>
                 <w:rFonts w:ascii="Courier New" w:hAnsi="Courier New" w:eastAsia="Courier New"/>
-                <w:sz w:val="18"/>
+                <w:sz w:val="17"/>
               </w:rPr>
               <w:t>%%</w:t>
               <w:br/>
@@ -3005,14 +4083,14 @@
             <w:r>
               <w:rPr>
                 <w:rFonts w:ascii="Courier New" w:hAnsi="Courier New" w:eastAsia="Courier New"/>
-                <w:sz w:val="18"/>
+                <w:sz w:val="17"/>
               </w:rPr>
               <w:br/>
             </w:r>
             <w:r>
               <w:rPr>
                 <w:rFonts w:ascii="Courier New" w:hAnsi="Courier New" w:eastAsia="Courier New"/>
-                <w:sz w:val="18"/>
+                <w:sz w:val="17"/>
               </w:rPr>
               <w:t>[0-9]+      {</w:t>
               <w:br/>
@@ -3020,7 +4098,7 @@
             <w:r>
               <w:rPr>
                 <w:rFonts w:ascii="Courier New" w:hAnsi="Courier New" w:eastAsia="Courier New"/>
-                <w:sz w:val="18"/>
+                <w:sz w:val="17"/>
               </w:rPr>
               <w:t xml:space="preserve">                yylval = atoi(yytext);</w:t>
               <w:br/>
@@ -3028,7 +4106,7 @@
             <w:r>
               <w:rPr>
                 <w:rFonts w:ascii="Courier New" w:hAnsi="Courier New" w:eastAsia="Courier New"/>
-                <w:sz w:val="18"/>
+                <w:sz w:val="17"/>
               </w:rPr>
               <w:t xml:space="preserve">                return INTEGER;</w:t>
               <w:br/>
@@ -3036,7 +4114,7 @@
             <w:r>
               <w:rPr>
                 <w:rFonts w:ascii="Courier New" w:hAnsi="Courier New" w:eastAsia="Courier New"/>
-                <w:sz w:val="18"/>
+                <w:sz w:val="17"/>
               </w:rPr>
               <w:t xml:space="preserve">            }</w:t>
               <w:br/>
@@ -3044,14 +4122,14 @@
             <w:r>
               <w:rPr>
                 <w:rFonts w:ascii="Courier New" w:hAnsi="Courier New" w:eastAsia="Courier New"/>
-                <w:sz w:val="18"/>
+                <w:sz w:val="17"/>
               </w:rPr>
               <w:br/>
             </w:r>
             <w:r>
               <w:rPr>
                 <w:rFonts w:ascii="Courier New" w:hAnsi="Courier New" w:eastAsia="Courier New"/>
-                <w:sz w:val="18"/>
+                <w:sz w:val="17"/>
               </w:rPr>
               <w:t>[-+\n]      return *yytext;</w:t>
               <w:br/>
@@ -3059,14 +4137,14 @@
             <w:r>
               <w:rPr>
                 <w:rFonts w:ascii="Courier New" w:hAnsi="Courier New" w:eastAsia="Courier New"/>
-                <w:sz w:val="18"/>
+                <w:sz w:val="17"/>
               </w:rPr>
               <w:br/>
             </w:r>
             <w:r>
               <w:rPr>
                 <w:rFonts w:ascii="Courier New" w:hAnsi="Courier New" w:eastAsia="Courier New"/>
-                <w:sz w:val="18"/>
+                <w:sz w:val="17"/>
               </w:rPr>
               <w:t>[ \t]       ;</w:t>
               <w:br/>
@@ -3074,14 +4152,14 @@
             <w:r>
               <w:rPr>
                 <w:rFonts w:ascii="Courier New" w:hAnsi="Courier New" w:eastAsia="Courier New"/>
-                <w:sz w:val="18"/>
+                <w:sz w:val="17"/>
               </w:rPr>
               <w:br/>
             </w:r>
             <w:r>
               <w:rPr>
                 <w:rFonts w:ascii="Courier New" w:hAnsi="Courier New" w:eastAsia="Courier New"/>
-                <w:sz w:val="18"/>
+                <w:sz w:val="17"/>
               </w:rPr>
               <w:t>.           yyerror("invalid character");</w:t>
               <w:br/>
@@ -3089,14 +4167,14 @@
             <w:r>
               <w:rPr>
                 <w:rFonts w:ascii="Courier New" w:hAnsi="Courier New" w:eastAsia="Courier New"/>
-                <w:sz w:val="18"/>
+                <w:sz w:val="17"/>
               </w:rPr>
               <w:br/>
             </w:r>
             <w:r>
               <w:rPr>
                 <w:rFonts w:ascii="Courier New" w:hAnsi="Courier New" w:eastAsia="Courier New"/>
-                <w:sz w:val="18"/>
+                <w:sz w:val="17"/>
               </w:rPr>
               <w:t>%%</w:t>
               <w:br/>
@@ -3104,14 +4182,14 @@
             <w:r>
               <w:rPr>
                 <w:rFonts w:ascii="Courier New" w:hAnsi="Courier New" w:eastAsia="Courier New"/>
-                <w:sz w:val="18"/>
+                <w:sz w:val="17"/>
               </w:rPr>
               <w:br/>
             </w:r>
             <w:r>
               <w:rPr>
                 <w:rFonts w:ascii="Courier New" w:hAnsi="Courier New" w:eastAsia="Courier New"/>
-                <w:sz w:val="18"/>
+                <w:sz w:val="17"/>
               </w:rPr>
               <w:t>int yywrap(void) {</w:t>
               <w:br/>
@@ -3119,7 +4197,7 @@
             <w:r>
               <w:rPr>
                 <w:rFonts w:ascii="Courier New" w:hAnsi="Courier New" w:eastAsia="Courier New"/>
-                <w:sz w:val="18"/>
+                <w:sz w:val="17"/>
               </w:rPr>
               <w:t xml:space="preserve">    return 1;</w:t>
               <w:br/>
@@ -3127,7 +4205,7 @@
             <w:r>
               <w:rPr>
                 <w:rFonts w:ascii="Courier New" w:hAnsi="Courier New" w:eastAsia="Courier New"/>
-                <w:sz w:val="18"/>
+                <w:sz w:val="17"/>
               </w:rPr>
               <w:t>}</w:t>
             </w:r>
@@ -3150,7 +4228,7 @@
           <w:b/>
           <w:sz w:val="21"/>
         </w:rPr>
-        <w:t xml:space="preserve">Table 2: </w:t>
+        <w:t xml:space="preserve">Table 3: </w:t>
       </w:r>
       <w:r>
         <w:rPr>
@@ -3602,7 +4680,7 @@
             <w:r>
               <w:rPr>
                 <w:rFonts w:ascii="Courier New" w:hAnsi="Courier New" w:eastAsia="Courier New"/>
-                <w:sz w:val="18"/>
+                <w:sz w:val="17"/>
               </w:rPr>
               <w:t>%{</w:t>
               <w:br/>
@@ -3610,7 +4688,7 @@
             <w:r>
               <w:rPr>
                 <w:rFonts w:ascii="Courier New" w:hAnsi="Courier New" w:eastAsia="Courier New"/>
-                <w:sz w:val="18"/>
+                <w:sz w:val="17"/>
               </w:rPr>
               <w:t xml:space="preserve">    #include &lt;stdio.h&gt;</w:t>
               <w:br/>
@@ -3618,7 +4696,7 @@
             <w:r>
               <w:rPr>
                 <w:rFonts w:ascii="Courier New" w:hAnsi="Courier New" w:eastAsia="Courier New"/>
-                <w:sz w:val="18"/>
+                <w:sz w:val="17"/>
               </w:rPr>
               <w:t xml:space="preserve">    int yylex(void);</w:t>
               <w:br/>
@@ -3626,7 +4704,7 @@
             <w:r>
               <w:rPr>
                 <w:rFonts w:ascii="Courier New" w:hAnsi="Courier New" w:eastAsia="Courier New"/>
-                <w:sz w:val="18"/>
+                <w:sz w:val="17"/>
               </w:rPr>
               <w:t xml:space="preserve">    void yyerror(char *);</w:t>
               <w:br/>
@@ -3634,7 +4712,7 @@
             <w:r>
               <w:rPr>
                 <w:rFonts w:ascii="Courier New" w:hAnsi="Courier New" w:eastAsia="Courier New"/>
-                <w:sz w:val="18"/>
+                <w:sz w:val="17"/>
               </w:rPr>
               <w:t>%}</w:t>
               <w:br/>
@@ -3642,14 +4720,14 @@
             <w:r>
               <w:rPr>
                 <w:rFonts w:ascii="Courier New" w:hAnsi="Courier New" w:eastAsia="Courier New"/>
-                <w:sz w:val="18"/>
+                <w:sz w:val="17"/>
               </w:rPr>
               <w:br/>
             </w:r>
             <w:r>
               <w:rPr>
                 <w:rFonts w:ascii="Courier New" w:hAnsi="Courier New" w:eastAsia="Courier New"/>
-                <w:sz w:val="18"/>
+                <w:sz w:val="17"/>
               </w:rPr>
               <w:t>%token INTEGER</w:t>
               <w:br/>
@@ -3657,14 +4735,14 @@
             <w:r>
               <w:rPr>
                 <w:rFonts w:ascii="Courier New" w:hAnsi="Courier New" w:eastAsia="Courier New"/>
-                <w:sz w:val="18"/>
+                <w:sz w:val="17"/>
               </w:rPr>
               <w:br/>
             </w:r>
             <w:r>
               <w:rPr>
                 <w:rFonts w:ascii="Courier New" w:hAnsi="Courier New" w:eastAsia="Courier New"/>
-                <w:sz w:val="18"/>
+                <w:sz w:val="17"/>
               </w:rPr>
               <w:t>%%</w:t>
               <w:br/>
@@ -3672,14 +4750,14 @@
             <w:r>
               <w:rPr>
                 <w:rFonts w:ascii="Courier New" w:hAnsi="Courier New" w:eastAsia="Courier New"/>
-                <w:sz w:val="18"/>
+                <w:sz w:val="17"/>
               </w:rPr>
               <w:br/>
             </w:r>
             <w:r>
               <w:rPr>
                 <w:rFonts w:ascii="Courier New" w:hAnsi="Courier New" w:eastAsia="Courier New"/>
-                <w:sz w:val="18"/>
+                <w:sz w:val="17"/>
               </w:rPr>
               <w:t>program:</w:t>
               <w:br/>
@@ -3687,7 +4765,7 @@
             <w:r>
               <w:rPr>
                 <w:rFonts w:ascii="Courier New" w:hAnsi="Courier New" w:eastAsia="Courier New"/>
-                <w:sz w:val="18"/>
+                <w:sz w:val="17"/>
               </w:rPr>
               <w:t xml:space="preserve">        program expr '\n'         { printf("%d\n", $2); }</w:t>
               <w:br/>
@@ -3695,7 +4773,7 @@
             <w:r>
               <w:rPr>
                 <w:rFonts w:ascii="Courier New" w:hAnsi="Courier New" w:eastAsia="Courier New"/>
-                <w:sz w:val="18"/>
+                <w:sz w:val="17"/>
               </w:rPr>
               <w:t xml:space="preserve">        |</w:t>
               <w:br/>
@@ -3703,7 +4781,7 @@
             <w:r>
               <w:rPr>
                 <w:rFonts w:ascii="Courier New" w:hAnsi="Courier New" w:eastAsia="Courier New"/>
-                <w:sz w:val="18"/>
+                <w:sz w:val="17"/>
               </w:rPr>
               <w:t xml:space="preserve">        ;</w:t>
               <w:br/>
@@ -3711,14 +4789,14 @@
             <w:r>
               <w:rPr>
                 <w:rFonts w:ascii="Courier New" w:hAnsi="Courier New" w:eastAsia="Courier New"/>
-                <w:sz w:val="18"/>
+                <w:sz w:val="17"/>
               </w:rPr>
               <w:br/>
             </w:r>
             <w:r>
               <w:rPr>
                 <w:rFonts w:ascii="Courier New" w:hAnsi="Courier New" w:eastAsia="Courier New"/>
-                <w:sz w:val="18"/>
+                <w:sz w:val="17"/>
               </w:rPr>
               <w:t>expr:</w:t>
               <w:br/>
@@ -3726,7 +4804,7 @@
             <w:r>
               <w:rPr>
                 <w:rFonts w:ascii="Courier New" w:hAnsi="Courier New" w:eastAsia="Courier New"/>
-                <w:sz w:val="18"/>
+                <w:sz w:val="17"/>
               </w:rPr>
               <w:t xml:space="preserve">        INTEGER                   { $$ = $1; }</w:t>
               <w:br/>
@@ -3734,7 +4812,7 @@
             <w:r>
               <w:rPr>
                 <w:rFonts w:ascii="Courier New" w:hAnsi="Courier New" w:eastAsia="Courier New"/>
-                <w:sz w:val="18"/>
+                <w:sz w:val="17"/>
               </w:rPr>
               <w:t xml:space="preserve">        | expr '+' expr           { $$ = $1 + $3; }</w:t>
               <w:br/>
@@ -3742,7 +4820,7 @@
             <w:r>
               <w:rPr>
                 <w:rFonts w:ascii="Courier New" w:hAnsi="Courier New" w:eastAsia="Courier New"/>
-                <w:sz w:val="18"/>
+                <w:sz w:val="17"/>
               </w:rPr>
               <w:t xml:space="preserve">        | expr '-' expr           { $$ = $1 - $3; }</w:t>
               <w:br/>
@@ -3750,7 +4828,7 @@
             <w:r>
               <w:rPr>
                 <w:rFonts w:ascii="Courier New" w:hAnsi="Courier New" w:eastAsia="Courier New"/>
-                <w:sz w:val="18"/>
+                <w:sz w:val="17"/>
               </w:rPr>
               <w:t xml:space="preserve">        ;</w:t>
               <w:br/>
@@ -3758,14 +4836,14 @@
             <w:r>
               <w:rPr>
                 <w:rFonts w:ascii="Courier New" w:hAnsi="Courier New" w:eastAsia="Courier New"/>
-                <w:sz w:val="18"/>
+                <w:sz w:val="17"/>
               </w:rPr>
               <w:br/>
             </w:r>
             <w:r>
               <w:rPr>
                 <w:rFonts w:ascii="Courier New" w:hAnsi="Courier New" w:eastAsia="Courier New"/>
-                <w:sz w:val="18"/>
+                <w:sz w:val="17"/>
               </w:rPr>
               <w:t>%%</w:t>
               <w:br/>
@@ -3773,14 +4851,14 @@
             <w:r>
               <w:rPr>
                 <w:rFonts w:ascii="Courier New" w:hAnsi="Courier New" w:eastAsia="Courier New"/>
-                <w:sz w:val="18"/>
+                <w:sz w:val="17"/>
               </w:rPr>
               <w:br/>
             </w:r>
             <w:r>
               <w:rPr>
                 <w:rFonts w:ascii="Courier New" w:hAnsi="Courier New" w:eastAsia="Courier New"/>
-                <w:sz w:val="18"/>
+                <w:sz w:val="17"/>
               </w:rPr>
               <w:t>void yyerror(char *s) {</w:t>
               <w:br/>
@@ -3788,7 +4866,7 @@
             <w:r>
               <w:rPr>
                 <w:rFonts w:ascii="Courier New" w:hAnsi="Courier New" w:eastAsia="Courier New"/>
-                <w:sz w:val="18"/>
+                <w:sz w:val="17"/>
               </w:rPr>
               <w:t xml:space="preserve">    fprintf(stderr, "%s\n", s);</w:t>
               <w:br/>
@@ -3796,7 +4874,7 @@
             <w:r>
               <w:rPr>
                 <w:rFonts w:ascii="Courier New" w:hAnsi="Courier New" w:eastAsia="Courier New"/>
-                <w:sz w:val="18"/>
+                <w:sz w:val="17"/>
               </w:rPr>
               <w:t>}</w:t>
               <w:br/>
@@ -3804,14 +4882,14 @@
             <w:r>
               <w:rPr>
                 <w:rFonts w:ascii="Courier New" w:hAnsi="Courier New" w:eastAsia="Courier New"/>
-                <w:sz w:val="18"/>
+                <w:sz w:val="17"/>
               </w:rPr>
               <w:br/>
             </w:r>
             <w:r>
               <w:rPr>
                 <w:rFonts w:ascii="Courier New" w:hAnsi="Courier New" w:eastAsia="Courier New"/>
-                <w:sz w:val="18"/>
+                <w:sz w:val="17"/>
               </w:rPr>
               <w:t>int main(void) {</w:t>
               <w:br/>
@@ -3819,7 +4897,7 @@
             <w:r>
               <w:rPr>
                 <w:rFonts w:ascii="Courier New" w:hAnsi="Courier New" w:eastAsia="Courier New"/>
-                <w:sz w:val="18"/>
+                <w:sz w:val="17"/>
               </w:rPr>
               <w:t xml:space="preserve">    yyparse();</w:t>
               <w:br/>
@@ -3827,7 +4905,7 @@
             <w:r>
               <w:rPr>
                 <w:rFonts w:ascii="Courier New" w:hAnsi="Courier New" w:eastAsia="Courier New"/>
-                <w:sz w:val="18"/>
+                <w:sz w:val="17"/>
               </w:rPr>
               <w:t xml:space="preserve">    return 0;</w:t>
               <w:br/>
@@ -3835,7 +4913,7 @@
             <w:r>
               <w:rPr>
                 <w:rFonts w:ascii="Courier New" w:hAnsi="Courier New" w:eastAsia="Courier New"/>
-                <w:sz w:val="18"/>
+                <w:sz w:val="17"/>
               </w:rPr>
               <w:t>}</w:t>
             </w:r>
@@ -3919,7 +4997,7 @@
             <w:r>
               <w:rPr>
                 <w:rFonts w:ascii="Courier New" w:hAnsi="Courier New" w:eastAsia="Courier New"/>
-                <w:sz w:val="18"/>
+                <w:sz w:val="17"/>
               </w:rPr>
               <w:t>&lt;program&gt; ::= &lt;program&gt; &lt;expr&gt; '\n'  |  ε</w:t>
               <w:br/>
@@ -3927,7 +5005,7 @@
             <w:r>
               <w:rPr>
                 <w:rFonts w:ascii="Courier New" w:hAnsi="Courier New" w:eastAsia="Courier New"/>
-                <w:sz w:val="18"/>
+                <w:sz w:val="17"/>
               </w:rPr>
               <w:t>&lt;expr&gt;    ::= INTEGER  |  &lt;expr&gt; '+' &lt;expr&gt;  |  &lt;expr&gt; '-' &lt;expr&gt;</w:t>
             </w:r>
@@ -4372,7 +5450,7 @@
             <w:r>
               <w:rPr>
                 <w:rFonts w:ascii="Courier New" w:hAnsi="Courier New" w:eastAsia="Courier New"/>
-                <w:sz w:val="18"/>
+                <w:sz w:val="17"/>
               </w:rPr>
               <w:t>%{</w:t>
               <w:br/>
@@ -4380,7 +5458,7 @@
             <w:r>
               <w:rPr>
                 <w:rFonts w:ascii="Courier New" w:hAnsi="Courier New" w:eastAsia="Courier New"/>
-                <w:sz w:val="18"/>
+                <w:sz w:val="17"/>
               </w:rPr>
               <w:t xml:space="preserve">    #include &lt;stdlib.h&gt;</w:t>
               <w:br/>
@@ -4388,7 +5466,7 @@
             <w:r>
               <w:rPr>
                 <w:rFonts w:ascii="Courier New" w:hAnsi="Courier New" w:eastAsia="Courier New"/>
-                <w:sz w:val="18"/>
+                <w:sz w:val="17"/>
               </w:rPr>
               <w:t xml:space="preserve">    #include "y.tab.h"</w:t>
               <w:br/>
@@ -4396,7 +5474,7 @@
             <w:r>
               <w:rPr>
                 <w:rFonts w:ascii="Courier New" w:hAnsi="Courier New" w:eastAsia="Courier New"/>
-                <w:sz w:val="18"/>
+                <w:sz w:val="17"/>
               </w:rPr>
               <w:t xml:space="preserve">    void yyerror(char *);</w:t>
               <w:br/>
@@ -4404,7 +5482,7 @@
             <w:r>
               <w:rPr>
                 <w:rFonts w:ascii="Courier New" w:hAnsi="Courier New" w:eastAsia="Courier New"/>
-                <w:sz w:val="18"/>
+                <w:sz w:val="17"/>
               </w:rPr>
               <w:t>%}</w:t>
               <w:br/>
@@ -4412,14 +5490,14 @@
             <w:r>
               <w:rPr>
                 <w:rFonts w:ascii="Courier New" w:hAnsi="Courier New" w:eastAsia="Courier New"/>
-                <w:sz w:val="18"/>
+                <w:sz w:val="17"/>
               </w:rPr>
               <w:br/>
             </w:r>
             <w:r>
               <w:rPr>
                 <w:rFonts w:ascii="Courier New" w:hAnsi="Courier New" w:eastAsia="Courier New"/>
-                <w:sz w:val="18"/>
+                <w:sz w:val="17"/>
               </w:rPr>
               <w:t>%%</w:t>
               <w:br/>
@@ -4427,14 +5505,14 @@
             <w:r>
               <w:rPr>
                 <w:rFonts w:ascii="Courier New" w:hAnsi="Courier New" w:eastAsia="Courier New"/>
-                <w:sz w:val="18"/>
+                <w:sz w:val="17"/>
               </w:rPr>
               <w:br/>
             </w:r>
             <w:r>
               <w:rPr>
                 <w:rFonts w:ascii="Courier New" w:hAnsi="Courier New" w:eastAsia="Courier New"/>
-                <w:sz w:val="18"/>
+                <w:sz w:val="17"/>
               </w:rPr>
               <w:t>[a-z]       {</w:t>
               <w:br/>
@@ -4442,7 +5520,7 @@
             <w:r>
               <w:rPr>
                 <w:rFonts w:ascii="Courier New" w:hAnsi="Courier New" w:eastAsia="Courier New"/>
-                <w:sz w:val="18"/>
+                <w:sz w:val="17"/>
               </w:rPr>
               <w:t xml:space="preserve">                yylval = *yytext - 'a';</w:t>
               <w:br/>
@@ -4450,7 +5528,7 @@
             <w:r>
               <w:rPr>
                 <w:rFonts w:ascii="Courier New" w:hAnsi="Courier New" w:eastAsia="Courier New"/>
-                <w:sz w:val="18"/>
+                <w:sz w:val="17"/>
               </w:rPr>
               <w:t xml:space="preserve">                return VARIABLE;</w:t>
               <w:br/>
@@ -4458,7 +5536,7 @@
             <w:r>
               <w:rPr>
                 <w:rFonts w:ascii="Courier New" w:hAnsi="Courier New" w:eastAsia="Courier New"/>
-                <w:sz w:val="18"/>
+                <w:sz w:val="17"/>
               </w:rPr>
               <w:t xml:space="preserve">            }</w:t>
               <w:br/>
@@ -4466,14 +5544,14 @@
             <w:r>
               <w:rPr>
                 <w:rFonts w:ascii="Courier New" w:hAnsi="Courier New" w:eastAsia="Courier New"/>
-                <w:sz w:val="18"/>
+                <w:sz w:val="17"/>
               </w:rPr>
               <w:br/>
             </w:r>
             <w:r>
               <w:rPr>
                 <w:rFonts w:ascii="Courier New" w:hAnsi="Courier New" w:eastAsia="Courier New"/>
-                <w:sz w:val="18"/>
+                <w:sz w:val="17"/>
               </w:rPr>
               <w:t>[0-9]+      {</w:t>
               <w:br/>
@@ -4481,7 +5559,7 @@
             <w:r>
               <w:rPr>
                 <w:rFonts w:ascii="Courier New" w:hAnsi="Courier New" w:eastAsia="Courier New"/>
-                <w:sz w:val="18"/>
+                <w:sz w:val="17"/>
               </w:rPr>
               <w:t xml:space="preserve">                yylval = atoi(yytext);</w:t>
               <w:br/>
@@ -4489,7 +5567,7 @@
             <w:r>
               <w:rPr>
                 <w:rFonts w:ascii="Courier New" w:hAnsi="Courier New" w:eastAsia="Courier New"/>
-                <w:sz w:val="18"/>
+                <w:sz w:val="17"/>
               </w:rPr>
               <w:t xml:space="preserve">                return INTEGER;</w:t>
               <w:br/>
@@ -4497,7 +5575,7 @@
             <w:r>
               <w:rPr>
                 <w:rFonts w:ascii="Courier New" w:hAnsi="Courier New" w:eastAsia="Courier New"/>
-                <w:sz w:val="18"/>
+                <w:sz w:val="17"/>
               </w:rPr>
               <w:t xml:space="preserve">            }</w:t>
               <w:br/>
@@ -4505,14 +5583,14 @@
             <w:r>
               <w:rPr>
                 <w:rFonts w:ascii="Courier New" w:hAnsi="Courier New" w:eastAsia="Courier New"/>
-                <w:sz w:val="18"/>
+                <w:sz w:val="17"/>
               </w:rPr>
               <w:br/>
             </w:r>
             <w:r>
               <w:rPr>
                 <w:rFonts w:ascii="Courier New" w:hAnsi="Courier New" w:eastAsia="Courier New"/>
-                <w:sz w:val="18"/>
+                <w:sz w:val="17"/>
               </w:rPr>
               <w:t>[-+()=/*\n] { return *yytext; }</w:t>
               <w:br/>
@@ -4520,14 +5598,14 @@
             <w:r>
               <w:rPr>
                 <w:rFonts w:ascii="Courier New" w:hAnsi="Courier New" w:eastAsia="Courier New"/>
-                <w:sz w:val="18"/>
+                <w:sz w:val="17"/>
               </w:rPr>
               <w:br/>
             </w:r>
             <w:r>
               <w:rPr>
                 <w:rFonts w:ascii="Courier New" w:hAnsi="Courier New" w:eastAsia="Courier New"/>
-                <w:sz w:val="18"/>
+                <w:sz w:val="17"/>
               </w:rPr>
               <w:t>[ \t]       ;</w:t>
               <w:br/>
@@ -4535,14 +5613,14 @@
             <w:r>
               <w:rPr>
                 <w:rFonts w:ascii="Courier New" w:hAnsi="Courier New" w:eastAsia="Courier New"/>
-                <w:sz w:val="18"/>
+                <w:sz w:val="17"/>
               </w:rPr>
               <w:br/>
             </w:r>
             <w:r>
               <w:rPr>
                 <w:rFonts w:ascii="Courier New" w:hAnsi="Courier New" w:eastAsia="Courier New"/>
-                <w:sz w:val="18"/>
+                <w:sz w:val="17"/>
               </w:rPr>
               <w:t>.           yyerror("invalid character");</w:t>
               <w:br/>
@@ -4550,14 +5628,14 @@
             <w:r>
               <w:rPr>
                 <w:rFonts w:ascii="Courier New" w:hAnsi="Courier New" w:eastAsia="Courier New"/>
-                <w:sz w:val="18"/>
+                <w:sz w:val="17"/>
               </w:rPr>
               <w:br/>
             </w:r>
             <w:r>
               <w:rPr>
                 <w:rFonts w:ascii="Courier New" w:hAnsi="Courier New" w:eastAsia="Courier New"/>
-                <w:sz w:val="18"/>
+                <w:sz w:val="17"/>
               </w:rPr>
               <w:t>%%</w:t>
               <w:br/>
@@ -4565,14 +5643,14 @@
             <w:r>
               <w:rPr>
                 <w:rFonts w:ascii="Courier New" w:hAnsi="Courier New" w:eastAsia="Courier New"/>
-                <w:sz w:val="18"/>
+                <w:sz w:val="17"/>
               </w:rPr>
               <w:br/>
             </w:r>
             <w:r>
               <w:rPr>
                 <w:rFonts w:ascii="Courier New" w:hAnsi="Courier New" w:eastAsia="Courier New"/>
-                <w:sz w:val="18"/>
+                <w:sz w:val="17"/>
               </w:rPr>
               <w:t>int yywrap(void) {</w:t>
               <w:br/>
@@ -4580,7 +5658,7 @@
             <w:r>
               <w:rPr>
                 <w:rFonts w:ascii="Courier New" w:hAnsi="Courier New" w:eastAsia="Courier New"/>
-                <w:sz w:val="18"/>
+                <w:sz w:val="17"/>
               </w:rPr>
               <w:t xml:space="preserve">    return 1;</w:t>
               <w:br/>
@@ -4588,7 +5666,7 @@
             <w:r>
               <w:rPr>
                 <w:rFonts w:ascii="Courier New" w:hAnsi="Courier New" w:eastAsia="Courier New"/>
-                <w:sz w:val="18"/>
+                <w:sz w:val="17"/>
               </w:rPr>
               <w:t>}</w:t>
             </w:r>
@@ -4611,7 +5689,7 @@
           <w:b/>
           <w:sz w:val="21"/>
         </w:rPr>
-        <w:t xml:space="preserve">Table 3: </w:t>
+        <w:t xml:space="preserve">Table 4: </w:t>
       </w:r>
       <w:r>
         <w:rPr>
@@ -5047,7 +6125,7 @@
             <w:r>
               <w:rPr>
                 <w:rFonts w:ascii="Courier New" w:hAnsi="Courier New" w:eastAsia="Courier New"/>
-                <w:sz w:val="18"/>
+                <w:sz w:val="17"/>
               </w:rPr>
               <w:t>%{</w:t>
               <w:br/>
@@ -5055,7 +6133,7 @@
             <w:r>
               <w:rPr>
                 <w:rFonts w:ascii="Courier New" w:hAnsi="Courier New" w:eastAsia="Courier New"/>
-                <w:sz w:val="18"/>
+                <w:sz w:val="17"/>
               </w:rPr>
               <w:t xml:space="preserve">    #include &lt;stdio.h&gt;</w:t>
               <w:br/>
@@ -5063,7 +6141,7 @@
             <w:r>
               <w:rPr>
                 <w:rFonts w:ascii="Courier New" w:hAnsi="Courier New" w:eastAsia="Courier New"/>
-                <w:sz w:val="18"/>
+                <w:sz w:val="17"/>
               </w:rPr>
               <w:t xml:space="preserve">    void yyerror(char *);</w:t>
               <w:br/>
@@ -5071,7 +6149,7 @@
             <w:r>
               <w:rPr>
                 <w:rFonts w:ascii="Courier New" w:hAnsi="Courier New" w:eastAsia="Courier New"/>
-                <w:sz w:val="18"/>
+                <w:sz w:val="17"/>
               </w:rPr>
               <w:t xml:space="preserve">    int yylex(void);</w:t>
               <w:br/>
@@ -5079,14 +6157,14 @@
             <w:r>
               <w:rPr>
                 <w:rFonts w:ascii="Courier New" w:hAnsi="Courier New" w:eastAsia="Courier New"/>
-                <w:sz w:val="18"/>
+                <w:sz w:val="17"/>
               </w:rPr>
               <w:br/>
             </w:r>
             <w:r>
               <w:rPr>
                 <w:rFonts w:ascii="Courier New" w:hAnsi="Courier New" w:eastAsia="Courier New"/>
-                <w:sz w:val="18"/>
+                <w:sz w:val="17"/>
               </w:rPr>
               <w:t xml:space="preserve">    int sym[26];</w:t>
               <w:br/>
@@ -5094,7 +6172,7 @@
             <w:r>
               <w:rPr>
                 <w:rFonts w:ascii="Courier New" w:hAnsi="Courier New" w:eastAsia="Courier New"/>
-                <w:sz w:val="18"/>
+                <w:sz w:val="17"/>
               </w:rPr>
               <w:t>%}</w:t>
               <w:br/>
@@ -5102,14 +6180,14 @@
             <w:r>
               <w:rPr>
                 <w:rFonts w:ascii="Courier New" w:hAnsi="Courier New" w:eastAsia="Courier New"/>
-                <w:sz w:val="18"/>
+                <w:sz w:val="17"/>
               </w:rPr>
               <w:br/>
             </w:r>
             <w:r>
               <w:rPr>
                 <w:rFonts w:ascii="Courier New" w:hAnsi="Courier New" w:eastAsia="Courier New"/>
-                <w:sz w:val="18"/>
+                <w:sz w:val="17"/>
               </w:rPr>
               <w:t>%token INTEGER VARIABLE</w:t>
               <w:br/>
@@ -5117,7 +6195,7 @@
             <w:r>
               <w:rPr>
                 <w:rFonts w:ascii="Courier New" w:hAnsi="Courier New" w:eastAsia="Courier New"/>
-                <w:sz w:val="18"/>
+                <w:sz w:val="17"/>
               </w:rPr>
               <w:t>%left '+' '-'</w:t>
               <w:br/>
@@ -5125,7 +6203,7 @@
             <w:r>
               <w:rPr>
                 <w:rFonts w:ascii="Courier New" w:hAnsi="Courier New" w:eastAsia="Courier New"/>
-                <w:sz w:val="18"/>
+                <w:sz w:val="17"/>
               </w:rPr>
               <w:t>%left '*' '/'</w:t>
               <w:br/>
@@ -5133,14 +6211,14 @@
             <w:r>
               <w:rPr>
                 <w:rFonts w:ascii="Courier New" w:hAnsi="Courier New" w:eastAsia="Courier New"/>
-                <w:sz w:val="18"/>
+                <w:sz w:val="17"/>
               </w:rPr>
               <w:br/>
             </w:r>
             <w:r>
               <w:rPr>
                 <w:rFonts w:ascii="Courier New" w:hAnsi="Courier New" w:eastAsia="Courier New"/>
-                <w:sz w:val="18"/>
+                <w:sz w:val="17"/>
               </w:rPr>
               <w:t>%%</w:t>
               <w:br/>
@@ -5148,14 +6226,14 @@
             <w:r>
               <w:rPr>
                 <w:rFonts w:ascii="Courier New" w:hAnsi="Courier New" w:eastAsia="Courier New"/>
-                <w:sz w:val="18"/>
+                <w:sz w:val="17"/>
               </w:rPr>
               <w:br/>
             </w:r>
             <w:r>
               <w:rPr>
                 <w:rFonts w:ascii="Courier New" w:hAnsi="Courier New" w:eastAsia="Courier New"/>
-                <w:sz w:val="18"/>
+                <w:sz w:val="17"/>
               </w:rPr>
               <w:t>program:</w:t>
               <w:br/>
@@ -5163,7 +6241,7 @@
             <w:r>
               <w:rPr>
                 <w:rFonts w:ascii="Courier New" w:hAnsi="Courier New" w:eastAsia="Courier New"/>
-                <w:sz w:val="18"/>
+                <w:sz w:val="17"/>
               </w:rPr>
               <w:t xml:space="preserve">        program statement '\n'</w:t>
               <w:br/>
@@ -5171,7 +6249,7 @@
             <w:r>
               <w:rPr>
                 <w:rFonts w:ascii="Courier New" w:hAnsi="Courier New" w:eastAsia="Courier New"/>
-                <w:sz w:val="18"/>
+                <w:sz w:val="17"/>
               </w:rPr>
               <w:t xml:space="preserve">        |</w:t>
               <w:br/>
@@ -5179,7 +6257,7 @@
             <w:r>
               <w:rPr>
                 <w:rFonts w:ascii="Courier New" w:hAnsi="Courier New" w:eastAsia="Courier New"/>
-                <w:sz w:val="18"/>
+                <w:sz w:val="17"/>
               </w:rPr>
               <w:t xml:space="preserve">        ;</w:t>
               <w:br/>
@@ -5187,14 +6265,14 @@
             <w:r>
               <w:rPr>
                 <w:rFonts w:ascii="Courier New" w:hAnsi="Courier New" w:eastAsia="Courier New"/>
-                <w:sz w:val="18"/>
+                <w:sz w:val="17"/>
               </w:rPr>
               <w:br/>
             </w:r>
             <w:r>
               <w:rPr>
                 <w:rFonts w:ascii="Courier New" w:hAnsi="Courier New" w:eastAsia="Courier New"/>
-                <w:sz w:val="18"/>
+                <w:sz w:val="17"/>
               </w:rPr>
               <w:t>statement:</w:t>
               <w:br/>
@@ -5202,7 +6280,7 @@
             <w:r>
               <w:rPr>
                 <w:rFonts w:ascii="Courier New" w:hAnsi="Courier New" w:eastAsia="Courier New"/>
-                <w:sz w:val="18"/>
+                <w:sz w:val="17"/>
               </w:rPr>
               <w:t xml:space="preserve">        expr                      { printf("%d\n", $1); }</w:t>
               <w:br/>
@@ -5210,7 +6288,7 @@
             <w:r>
               <w:rPr>
                 <w:rFonts w:ascii="Courier New" w:hAnsi="Courier New" w:eastAsia="Courier New"/>
-                <w:sz w:val="18"/>
+                <w:sz w:val="17"/>
               </w:rPr>
               <w:t xml:space="preserve">        | VARIABLE '=' expr       { sym[$1] = $3; }</w:t>
               <w:br/>
@@ -5218,7 +6296,7 @@
             <w:r>
               <w:rPr>
                 <w:rFonts w:ascii="Courier New" w:hAnsi="Courier New" w:eastAsia="Courier New"/>
-                <w:sz w:val="18"/>
+                <w:sz w:val="17"/>
               </w:rPr>
               <w:t xml:space="preserve">        ;</w:t>
               <w:br/>
@@ -5226,14 +6304,14 @@
             <w:r>
               <w:rPr>
                 <w:rFonts w:ascii="Courier New" w:hAnsi="Courier New" w:eastAsia="Courier New"/>
-                <w:sz w:val="18"/>
+                <w:sz w:val="17"/>
               </w:rPr>
               <w:br/>
             </w:r>
             <w:r>
               <w:rPr>
                 <w:rFonts w:ascii="Courier New" w:hAnsi="Courier New" w:eastAsia="Courier New"/>
-                <w:sz w:val="18"/>
+                <w:sz w:val="17"/>
               </w:rPr>
               <w:t>expr:</w:t>
               <w:br/>
@@ -5241,7 +6319,7 @@
             <w:r>
               <w:rPr>
                 <w:rFonts w:ascii="Courier New" w:hAnsi="Courier New" w:eastAsia="Courier New"/>
-                <w:sz w:val="18"/>
+                <w:sz w:val="17"/>
               </w:rPr>
               <w:t xml:space="preserve">        INTEGER</w:t>
               <w:br/>
@@ -5249,7 +6327,7 @@
             <w:r>
               <w:rPr>
                 <w:rFonts w:ascii="Courier New" w:hAnsi="Courier New" w:eastAsia="Courier New"/>
-                <w:sz w:val="18"/>
+                <w:sz w:val="17"/>
               </w:rPr>
               <w:t xml:space="preserve">        | VARIABLE                { $$ = sym[$1]; }</w:t>
               <w:br/>
@@ -5257,7 +6335,7 @@
             <w:r>
               <w:rPr>
                 <w:rFonts w:ascii="Courier New" w:hAnsi="Courier New" w:eastAsia="Courier New"/>
-                <w:sz w:val="18"/>
+                <w:sz w:val="17"/>
               </w:rPr>
               <w:t xml:space="preserve">        | expr '+' expr           { $$ = $1 + $3; }</w:t>
               <w:br/>
@@ -5265,7 +6343,7 @@
             <w:r>
               <w:rPr>
                 <w:rFonts w:ascii="Courier New" w:hAnsi="Courier New" w:eastAsia="Courier New"/>
-                <w:sz w:val="18"/>
+                <w:sz w:val="17"/>
               </w:rPr>
               <w:t xml:space="preserve">        | expr '-' expr           { $$ = $1 - $3; }</w:t>
               <w:br/>
@@ -5273,7 +6351,7 @@
             <w:r>
               <w:rPr>
                 <w:rFonts w:ascii="Courier New" w:hAnsi="Courier New" w:eastAsia="Courier New"/>
-                <w:sz w:val="18"/>
+                <w:sz w:val="17"/>
               </w:rPr>
               <w:t xml:space="preserve">        | expr '*' expr           { $$ = $1 * $3; }</w:t>
               <w:br/>
@@ -5281,7 +6359,7 @@
             <w:r>
               <w:rPr>
                 <w:rFonts w:ascii="Courier New" w:hAnsi="Courier New" w:eastAsia="Courier New"/>
-                <w:sz w:val="18"/>
+                <w:sz w:val="17"/>
               </w:rPr>
               <w:t xml:space="preserve">        | expr '/' expr           { $$ = $1 / $3; }</w:t>
               <w:br/>
@@ -5289,7 +6367,7 @@
             <w:r>
               <w:rPr>
                 <w:rFonts w:ascii="Courier New" w:hAnsi="Courier New" w:eastAsia="Courier New"/>
-                <w:sz w:val="18"/>
+                <w:sz w:val="17"/>
               </w:rPr>
               <w:t xml:space="preserve">        | '(' expr ')'            { $$ = $2; }</w:t>
               <w:br/>
@@ -5297,7 +6375,7 @@
             <w:r>
               <w:rPr>
                 <w:rFonts w:ascii="Courier New" w:hAnsi="Courier New" w:eastAsia="Courier New"/>
-                <w:sz w:val="18"/>
+                <w:sz w:val="17"/>
               </w:rPr>
               <w:t xml:space="preserve">        ;</w:t>
               <w:br/>
@@ -5305,14 +6383,14 @@
             <w:r>
               <w:rPr>
                 <w:rFonts w:ascii="Courier New" w:hAnsi="Courier New" w:eastAsia="Courier New"/>
-                <w:sz w:val="18"/>
+                <w:sz w:val="17"/>
               </w:rPr>
               <w:br/>
             </w:r>
             <w:r>
               <w:rPr>
                 <w:rFonts w:ascii="Courier New" w:hAnsi="Courier New" w:eastAsia="Courier New"/>
-                <w:sz w:val="18"/>
+                <w:sz w:val="17"/>
               </w:rPr>
               <w:t>%%</w:t>
               <w:br/>
@@ -5320,14 +6398,14 @@
             <w:r>
               <w:rPr>
                 <w:rFonts w:ascii="Courier New" w:hAnsi="Courier New" w:eastAsia="Courier New"/>
-                <w:sz w:val="18"/>
+                <w:sz w:val="17"/>
               </w:rPr>
               <w:br/>
             </w:r>
             <w:r>
               <w:rPr>
                 <w:rFonts w:ascii="Courier New" w:hAnsi="Courier New" w:eastAsia="Courier New"/>
-                <w:sz w:val="18"/>
+                <w:sz w:val="17"/>
               </w:rPr>
               <w:t>void yyerror(char *s) {</w:t>
               <w:br/>
@@ -5335,7 +6413,7 @@
             <w:r>
               <w:rPr>
                 <w:rFonts w:ascii="Courier New" w:hAnsi="Courier New" w:eastAsia="Courier New"/>
-                <w:sz w:val="18"/>
+                <w:sz w:val="17"/>
               </w:rPr>
               <w:t xml:space="preserve">    fprintf(stderr, "%s\n", s);</w:t>
               <w:br/>
@@ -5343,7 +6421,7 @@
             <w:r>
               <w:rPr>
                 <w:rFonts w:ascii="Courier New" w:hAnsi="Courier New" w:eastAsia="Courier New"/>
-                <w:sz w:val="18"/>
+                <w:sz w:val="17"/>
               </w:rPr>
               <w:t>}</w:t>
               <w:br/>
@@ -5351,14 +6429,14 @@
             <w:r>
               <w:rPr>
                 <w:rFonts w:ascii="Courier New" w:hAnsi="Courier New" w:eastAsia="Courier New"/>
-                <w:sz w:val="18"/>
+                <w:sz w:val="17"/>
               </w:rPr>
               <w:br/>
             </w:r>
             <w:r>
               <w:rPr>
                 <w:rFonts w:ascii="Courier New" w:hAnsi="Courier New" w:eastAsia="Courier New"/>
-                <w:sz w:val="18"/>
+                <w:sz w:val="17"/>
               </w:rPr>
               <w:t>int main(void) {</w:t>
               <w:br/>
@@ -5366,7 +6444,7 @@
             <w:r>
               <w:rPr>
                 <w:rFonts w:ascii="Courier New" w:hAnsi="Courier New" w:eastAsia="Courier New"/>
-                <w:sz w:val="18"/>
+                <w:sz w:val="17"/>
               </w:rPr>
               <w:t xml:space="preserve">    yyparse();</w:t>
               <w:br/>
@@ -5374,7 +6452,7 @@
             <w:r>
               <w:rPr>
                 <w:rFonts w:ascii="Courier New" w:hAnsi="Courier New" w:eastAsia="Courier New"/>
-                <w:sz w:val="18"/>
+                <w:sz w:val="17"/>
               </w:rPr>
               <w:t xml:space="preserve">    return 0;</w:t>
               <w:br/>
@@ -5382,7 +6460,7 @@
             <w:r>
               <w:rPr>
                 <w:rFonts w:ascii="Courier New" w:hAnsi="Courier New" w:eastAsia="Courier New"/>
-                <w:sz w:val="18"/>
+                <w:sz w:val="17"/>
               </w:rPr>
               <w:t>}</w:t>
             </w:r>
@@ -5496,7 +6574,7 @@
             <w:r>
               <w:rPr>
                 <w:rFonts w:ascii="Courier New" w:hAnsi="Courier New" w:eastAsia="Courier New"/>
-                <w:sz w:val="18"/>
+                <w:sz w:val="17"/>
               </w:rPr>
               <w:t>&lt;program&gt;   ::= &lt;program&gt; &lt;statement&gt; '\n'  |  ε</w:t>
               <w:br/>
@@ -5504,7 +6582,7 @@
             <w:r>
               <w:rPr>
                 <w:rFonts w:ascii="Courier New" w:hAnsi="Courier New" w:eastAsia="Courier New"/>
-                <w:sz w:val="18"/>
+                <w:sz w:val="17"/>
               </w:rPr>
               <w:t>&lt;statement&gt; ::= &lt;expr&gt;  |  VARIABLE '=' &lt;expr&gt;</w:t>
               <w:br/>
@@ -5512,7 +6590,7 @@
             <w:r>
               <w:rPr>
                 <w:rFonts w:ascii="Courier New" w:hAnsi="Courier New" w:eastAsia="Courier New"/>
-                <w:sz w:val="18"/>
+                <w:sz w:val="17"/>
               </w:rPr>
               <w:t>&lt;expr&gt;      ::= INTEGER | VARIABLE | &lt;expr&gt; '+' &lt;expr&gt; | &lt;expr&gt; '-' &lt;expr&gt;</w:t>
               <w:br/>
@@ -5520,7 +6598,7 @@
             <w:r>
               <w:rPr>
                 <w:rFonts w:ascii="Courier New" w:hAnsi="Courier New" w:eastAsia="Courier New"/>
-                <w:sz w:val="18"/>
+                <w:sz w:val="17"/>
               </w:rPr>
               <w:t xml:space="preserve">              | &lt;expr&gt; '*' &lt;expr&gt; | &lt;expr&gt; '/' &lt;expr&gt; | '(' &lt;expr&gt; ')'</w:t>
             </w:r>
@@ -5817,7 +6895,7 @@
             <w:r>
               <w:rPr>
                 <w:rFonts w:ascii="Courier New" w:hAnsi="Courier New" w:eastAsia="Courier New"/>
-                <w:sz w:val="18"/>
+                <w:sz w:val="17"/>
               </w:rPr>
               <w:t>typedef enum { typeCon, typeId, typeOpr } nodeEnum;</w:t>
               <w:br/>
@@ -5825,14 +6903,14 @@
             <w:r>
               <w:rPr>
                 <w:rFonts w:ascii="Courier New" w:hAnsi="Courier New" w:eastAsia="Courier New"/>
-                <w:sz w:val="18"/>
+                <w:sz w:val="17"/>
               </w:rPr>
               <w:br/>
             </w:r>
             <w:r>
               <w:rPr>
                 <w:rFonts w:ascii="Courier New" w:hAnsi="Courier New" w:eastAsia="Courier New"/>
-                <w:sz w:val="18"/>
+                <w:sz w:val="17"/>
               </w:rPr>
               <w:t>typedef struct {</w:t>
               <w:br/>
@@ -5840,7 +6918,7 @@
             <w:r>
               <w:rPr>
                 <w:rFonts w:ascii="Courier New" w:hAnsi="Courier New" w:eastAsia="Courier New"/>
-                <w:sz w:val="18"/>
+                <w:sz w:val="17"/>
               </w:rPr>
               <w:t xml:space="preserve">    int value;</w:t>
               <w:br/>
@@ -5848,7 +6926,7 @@
             <w:r>
               <w:rPr>
                 <w:rFonts w:ascii="Courier New" w:hAnsi="Courier New" w:eastAsia="Courier New"/>
-                <w:sz w:val="18"/>
+                <w:sz w:val="17"/>
               </w:rPr>
               <w:t>} conNodeType;</w:t>
               <w:br/>
@@ -5856,14 +6934,14 @@
             <w:r>
               <w:rPr>
                 <w:rFonts w:ascii="Courier New" w:hAnsi="Courier New" w:eastAsia="Courier New"/>
-                <w:sz w:val="18"/>
+                <w:sz w:val="17"/>
               </w:rPr>
               <w:br/>
             </w:r>
             <w:r>
               <w:rPr>
                 <w:rFonts w:ascii="Courier New" w:hAnsi="Courier New" w:eastAsia="Courier New"/>
-                <w:sz w:val="18"/>
+                <w:sz w:val="17"/>
               </w:rPr>
               <w:t>typedef struct {</w:t>
               <w:br/>
@@ -5871,7 +6949,7 @@
             <w:r>
               <w:rPr>
                 <w:rFonts w:ascii="Courier New" w:hAnsi="Courier New" w:eastAsia="Courier New"/>
-                <w:sz w:val="18"/>
+                <w:sz w:val="17"/>
               </w:rPr>
               <w:t xml:space="preserve">    int i;</w:t>
               <w:br/>
@@ -5879,7 +6957,7 @@
             <w:r>
               <w:rPr>
                 <w:rFonts w:ascii="Courier New" w:hAnsi="Courier New" w:eastAsia="Courier New"/>
-                <w:sz w:val="18"/>
+                <w:sz w:val="17"/>
               </w:rPr>
               <w:t>} idNodeType;</w:t>
               <w:br/>
@@ -5887,14 +6965,14 @@
             <w:r>
               <w:rPr>
                 <w:rFonts w:ascii="Courier New" w:hAnsi="Courier New" w:eastAsia="Courier New"/>
-                <w:sz w:val="18"/>
+                <w:sz w:val="17"/>
               </w:rPr>
               <w:br/>
             </w:r>
             <w:r>
               <w:rPr>
                 <w:rFonts w:ascii="Courier New" w:hAnsi="Courier New" w:eastAsia="Courier New"/>
-                <w:sz w:val="18"/>
+                <w:sz w:val="17"/>
               </w:rPr>
               <w:t>typedef struct {</w:t>
               <w:br/>
@@ -5902,7 +6980,7 @@
             <w:r>
               <w:rPr>
                 <w:rFonts w:ascii="Courier New" w:hAnsi="Courier New" w:eastAsia="Courier New"/>
-                <w:sz w:val="18"/>
+                <w:sz w:val="17"/>
               </w:rPr>
               <w:t xml:space="preserve">    int oper;</w:t>
               <w:br/>
@@ -5910,7 +6988,7 @@
             <w:r>
               <w:rPr>
                 <w:rFonts w:ascii="Courier New" w:hAnsi="Courier New" w:eastAsia="Courier New"/>
-                <w:sz w:val="18"/>
+                <w:sz w:val="17"/>
               </w:rPr>
               <w:t xml:space="preserve">    int nops;</w:t>
               <w:br/>
@@ -5918,7 +6996,7 @@
             <w:r>
               <w:rPr>
                 <w:rFonts w:ascii="Courier New" w:hAnsi="Courier New" w:eastAsia="Courier New"/>
-                <w:sz w:val="18"/>
+                <w:sz w:val="17"/>
               </w:rPr>
               <w:t xml:space="preserve">    struct nodeTypeTag *op[1];</w:t>
               <w:br/>
@@ -5926,7 +7004,7 @@
             <w:r>
               <w:rPr>
                 <w:rFonts w:ascii="Courier New" w:hAnsi="Courier New" w:eastAsia="Courier New"/>
-                <w:sz w:val="18"/>
+                <w:sz w:val="17"/>
               </w:rPr>
               <w:t>} oprNodeType;</w:t>
               <w:br/>
@@ -5934,14 +7012,14 @@
             <w:r>
               <w:rPr>
                 <w:rFonts w:ascii="Courier New" w:hAnsi="Courier New" w:eastAsia="Courier New"/>
-                <w:sz w:val="18"/>
+                <w:sz w:val="17"/>
               </w:rPr>
               <w:br/>
             </w:r>
             <w:r>
               <w:rPr>
                 <w:rFonts w:ascii="Courier New" w:hAnsi="Courier New" w:eastAsia="Courier New"/>
-                <w:sz w:val="18"/>
+                <w:sz w:val="17"/>
               </w:rPr>
               <w:t>typedef struct nodeTypeTag {</w:t>
               <w:br/>
@@ -5949,7 +7027,7 @@
             <w:r>
               <w:rPr>
                 <w:rFonts w:ascii="Courier New" w:hAnsi="Courier New" w:eastAsia="Courier New"/>
-                <w:sz w:val="18"/>
+                <w:sz w:val="17"/>
               </w:rPr>
               <w:t xml:space="preserve">    nodeEnum type;</w:t>
               <w:br/>
@@ -5957,14 +7035,14 @@
             <w:r>
               <w:rPr>
                 <w:rFonts w:ascii="Courier New" w:hAnsi="Courier New" w:eastAsia="Courier New"/>
-                <w:sz w:val="18"/>
+                <w:sz w:val="17"/>
               </w:rPr>
               <w:br/>
             </w:r>
             <w:r>
               <w:rPr>
                 <w:rFonts w:ascii="Courier New" w:hAnsi="Courier New" w:eastAsia="Courier New"/>
-                <w:sz w:val="18"/>
+                <w:sz w:val="17"/>
               </w:rPr>
               <w:t xml:space="preserve">    union {</w:t>
               <w:br/>
@@ -5972,7 +7050,7 @@
             <w:r>
               <w:rPr>
                 <w:rFonts w:ascii="Courier New" w:hAnsi="Courier New" w:eastAsia="Courier New"/>
-                <w:sz w:val="18"/>
+                <w:sz w:val="17"/>
               </w:rPr>
               <w:t xml:space="preserve">        conNodeType con;</w:t>
               <w:br/>
@@ -5980,7 +7058,7 @@
             <w:r>
               <w:rPr>
                 <w:rFonts w:ascii="Courier New" w:hAnsi="Courier New" w:eastAsia="Courier New"/>
-                <w:sz w:val="18"/>
+                <w:sz w:val="17"/>
               </w:rPr>
               <w:t xml:space="preserve">        idNodeType id;</w:t>
               <w:br/>
@@ -5988,7 +7066,7 @@
             <w:r>
               <w:rPr>
                 <w:rFonts w:ascii="Courier New" w:hAnsi="Courier New" w:eastAsia="Courier New"/>
-                <w:sz w:val="18"/>
+                <w:sz w:val="17"/>
               </w:rPr>
               <w:t xml:space="preserve">        oprNodeType opr;</w:t>
               <w:br/>
@@ -5996,7 +7074,7 @@
             <w:r>
               <w:rPr>
                 <w:rFonts w:ascii="Courier New" w:hAnsi="Courier New" w:eastAsia="Courier New"/>
-                <w:sz w:val="18"/>
+                <w:sz w:val="17"/>
               </w:rPr>
               <w:t xml:space="preserve">    };</w:t>
               <w:br/>
@@ -6004,7 +7082,7 @@
             <w:r>
               <w:rPr>
                 <w:rFonts w:ascii="Courier New" w:hAnsi="Courier New" w:eastAsia="Courier New"/>
-                <w:sz w:val="18"/>
+                <w:sz w:val="17"/>
               </w:rPr>
               <w:t>} nodeType;</w:t>
               <w:br/>
@@ -6012,14 +7090,14 @@
             <w:r>
               <w:rPr>
                 <w:rFonts w:ascii="Courier New" w:hAnsi="Courier New" w:eastAsia="Courier New"/>
-                <w:sz w:val="18"/>
+                <w:sz w:val="17"/>
               </w:rPr>
               <w:br/>
             </w:r>
             <w:r>
               <w:rPr>
                 <w:rFonts w:ascii="Courier New" w:hAnsi="Courier New" w:eastAsia="Courier New"/>
-                <w:sz w:val="18"/>
+                <w:sz w:val="17"/>
               </w:rPr>
               <w:t>extern int sym[26];</w:t>
             </w:r>
@@ -6204,7 +7282,7 @@
             <w:r>
               <w:rPr>
                 <w:rFonts w:ascii="Courier New" w:hAnsi="Courier New" w:eastAsia="Courier New"/>
-                <w:sz w:val="18"/>
+                <w:sz w:val="17"/>
               </w:rPr>
               <w:t>%{</w:t>
               <w:br/>
@@ -6212,7 +7290,7 @@
             <w:r>
               <w:rPr>
                 <w:rFonts w:ascii="Courier New" w:hAnsi="Courier New" w:eastAsia="Courier New"/>
-                <w:sz w:val="18"/>
+                <w:sz w:val="17"/>
               </w:rPr>
               <w:t>#include &lt;stdlib.h&gt;</w:t>
               <w:br/>
@@ -6220,7 +7298,7 @@
             <w:r>
               <w:rPr>
                 <w:rFonts w:ascii="Courier New" w:hAnsi="Courier New" w:eastAsia="Courier New"/>
-                <w:sz w:val="18"/>
+                <w:sz w:val="17"/>
               </w:rPr>
               <w:t>#include "calc3.h"</w:t>
               <w:br/>
@@ -6228,7 +7306,7 @@
             <w:r>
               <w:rPr>
                 <w:rFonts w:ascii="Courier New" w:hAnsi="Courier New" w:eastAsia="Courier New"/>
-                <w:sz w:val="18"/>
+                <w:sz w:val="17"/>
               </w:rPr>
               <w:t>#include "y.tab.h"</w:t>
               <w:br/>
@@ -6236,7 +7314,7 @@
             <w:r>
               <w:rPr>
                 <w:rFonts w:ascii="Courier New" w:hAnsi="Courier New" w:eastAsia="Courier New"/>
-                <w:sz w:val="18"/>
+                <w:sz w:val="17"/>
               </w:rPr>
               <w:t>void yyerror(char *);</w:t>
               <w:br/>
@@ -6244,7 +7322,7 @@
             <w:r>
               <w:rPr>
                 <w:rFonts w:ascii="Courier New" w:hAnsi="Courier New" w:eastAsia="Courier New"/>
-                <w:sz w:val="18"/>
+                <w:sz w:val="17"/>
               </w:rPr>
               <w:t>%}</w:t>
               <w:br/>
@@ -6252,14 +7330,14 @@
             <w:r>
               <w:rPr>
                 <w:rFonts w:ascii="Courier New" w:hAnsi="Courier New" w:eastAsia="Courier New"/>
-                <w:sz w:val="18"/>
+                <w:sz w:val="17"/>
               </w:rPr>
               <w:br/>
             </w:r>
             <w:r>
               <w:rPr>
                 <w:rFonts w:ascii="Courier New" w:hAnsi="Courier New" w:eastAsia="Courier New"/>
-                <w:sz w:val="18"/>
+                <w:sz w:val="17"/>
               </w:rPr>
               <w:t>%%</w:t>
               <w:br/>
@@ -6267,14 +7345,14 @@
             <w:r>
               <w:rPr>
                 <w:rFonts w:ascii="Courier New" w:hAnsi="Courier New" w:eastAsia="Courier New"/>
-                <w:sz w:val="18"/>
+                <w:sz w:val="17"/>
               </w:rPr>
               <w:br/>
             </w:r>
             <w:r>
               <w:rPr>
                 <w:rFonts w:ascii="Courier New" w:hAnsi="Courier New" w:eastAsia="Courier New"/>
-                <w:sz w:val="18"/>
+                <w:sz w:val="17"/>
               </w:rPr>
               <w:t>[a-z]       {</w:t>
               <w:br/>
@@ -6282,7 +7360,7 @@
             <w:r>
               <w:rPr>
                 <w:rFonts w:ascii="Courier New" w:hAnsi="Courier New" w:eastAsia="Courier New"/>
-                <w:sz w:val="18"/>
+                <w:sz w:val="17"/>
               </w:rPr>
               <w:t xml:space="preserve">                yylval.sIndex = *yytext - 'a';</w:t>
               <w:br/>
@@ -6290,7 +7368,7 @@
             <w:r>
               <w:rPr>
                 <w:rFonts w:ascii="Courier New" w:hAnsi="Courier New" w:eastAsia="Courier New"/>
-                <w:sz w:val="18"/>
+                <w:sz w:val="17"/>
               </w:rPr>
               <w:t xml:space="preserve">                return VARIABLE;</w:t>
               <w:br/>
@@ -6298,7 +7376,7 @@
             <w:r>
               <w:rPr>
                 <w:rFonts w:ascii="Courier New" w:hAnsi="Courier New" w:eastAsia="Courier New"/>
-                <w:sz w:val="18"/>
+                <w:sz w:val="17"/>
               </w:rPr>
               <w:t xml:space="preserve">            }</w:t>
               <w:br/>
@@ -6306,14 +7384,14 @@
             <w:r>
               <w:rPr>
                 <w:rFonts w:ascii="Courier New" w:hAnsi="Courier New" w:eastAsia="Courier New"/>
-                <w:sz w:val="18"/>
+                <w:sz w:val="17"/>
               </w:rPr>
               <w:br/>
             </w:r>
             <w:r>
               <w:rPr>
                 <w:rFonts w:ascii="Courier New" w:hAnsi="Courier New" w:eastAsia="Courier New"/>
-                <w:sz w:val="18"/>
+                <w:sz w:val="17"/>
               </w:rPr>
               <w:t>0           {</w:t>
               <w:br/>
@@ -6321,7 +7399,7 @@
             <w:r>
               <w:rPr>
                 <w:rFonts w:ascii="Courier New" w:hAnsi="Courier New" w:eastAsia="Courier New"/>
-                <w:sz w:val="18"/>
+                <w:sz w:val="17"/>
               </w:rPr>
               <w:t xml:space="preserve">                yylval.iValue = atoi(yytext);</w:t>
               <w:br/>
@@ -6329,7 +7407,7 @@
             <w:r>
               <w:rPr>
                 <w:rFonts w:ascii="Courier New" w:hAnsi="Courier New" w:eastAsia="Courier New"/>
-                <w:sz w:val="18"/>
+                <w:sz w:val="17"/>
               </w:rPr>
               <w:t xml:space="preserve">                return INTEGER;</w:t>
               <w:br/>
@@ -6337,7 +7415,7 @@
             <w:r>
               <w:rPr>
                 <w:rFonts w:ascii="Courier New" w:hAnsi="Courier New" w:eastAsia="Courier New"/>
-                <w:sz w:val="18"/>
+                <w:sz w:val="17"/>
               </w:rPr>
               <w:t xml:space="preserve">            }</w:t>
               <w:br/>
@@ -6345,14 +7423,14 @@
             <w:r>
               <w:rPr>
                 <w:rFonts w:ascii="Courier New" w:hAnsi="Courier New" w:eastAsia="Courier New"/>
-                <w:sz w:val="18"/>
+                <w:sz w:val="17"/>
               </w:rPr>
               <w:br/>
             </w:r>
             <w:r>
               <w:rPr>
                 <w:rFonts w:ascii="Courier New" w:hAnsi="Courier New" w:eastAsia="Courier New"/>
-                <w:sz w:val="18"/>
+                <w:sz w:val="17"/>
               </w:rPr>
               <w:t>[1-9][0-9]* {</w:t>
               <w:br/>
@@ -6360,7 +7438,7 @@
             <w:r>
               <w:rPr>
                 <w:rFonts w:ascii="Courier New" w:hAnsi="Courier New" w:eastAsia="Courier New"/>
-                <w:sz w:val="18"/>
+                <w:sz w:val="17"/>
               </w:rPr>
               <w:t xml:space="preserve">                yylval.iValue = atoi(yytext);</w:t>
               <w:br/>
@@ -6368,7 +7446,7 @@
             <w:r>
               <w:rPr>
                 <w:rFonts w:ascii="Courier New" w:hAnsi="Courier New" w:eastAsia="Courier New"/>
-                <w:sz w:val="18"/>
+                <w:sz w:val="17"/>
               </w:rPr>
               <w:t xml:space="preserve">                return INTEGER;</w:t>
               <w:br/>
@@ -6376,7 +7454,7 @@
             <w:r>
               <w:rPr>
                 <w:rFonts w:ascii="Courier New" w:hAnsi="Courier New" w:eastAsia="Courier New"/>
-                <w:sz w:val="18"/>
+                <w:sz w:val="17"/>
               </w:rPr>
               <w:t xml:space="preserve">            }</w:t>
               <w:br/>
@@ -6384,14 +7462,14 @@
             <w:r>
               <w:rPr>
                 <w:rFonts w:ascii="Courier New" w:hAnsi="Courier New" w:eastAsia="Courier New"/>
-                <w:sz w:val="18"/>
+                <w:sz w:val="17"/>
               </w:rPr>
               <w:br/>
             </w:r>
             <w:r>
               <w:rPr>
                 <w:rFonts w:ascii="Courier New" w:hAnsi="Courier New" w:eastAsia="Courier New"/>
-                <w:sz w:val="18"/>
+                <w:sz w:val="17"/>
               </w:rPr>
               <w:t>[-()&lt;&gt;=+*/;{}.] {</w:t>
               <w:br/>
@@ -6399,7 +7477,7 @@
             <w:r>
               <w:rPr>
                 <w:rFonts w:ascii="Courier New" w:hAnsi="Courier New" w:eastAsia="Courier New"/>
-                <w:sz w:val="18"/>
+                <w:sz w:val="17"/>
               </w:rPr>
               <w:t xml:space="preserve">                return *yytext;</w:t>
               <w:br/>
@@ -6407,7 +7485,7 @@
             <w:r>
               <w:rPr>
                 <w:rFonts w:ascii="Courier New" w:hAnsi="Courier New" w:eastAsia="Courier New"/>
-                <w:sz w:val="18"/>
+                <w:sz w:val="17"/>
               </w:rPr>
               <w:t xml:space="preserve">            }</w:t>
               <w:br/>
@@ -6415,14 +7493,14 @@
             <w:r>
               <w:rPr>
                 <w:rFonts w:ascii="Courier New" w:hAnsi="Courier New" w:eastAsia="Courier New"/>
-                <w:sz w:val="18"/>
+                <w:sz w:val="17"/>
               </w:rPr>
               <w:br/>
             </w:r>
             <w:r>
               <w:rPr>
                 <w:rFonts w:ascii="Courier New" w:hAnsi="Courier New" w:eastAsia="Courier New"/>
-                <w:sz w:val="18"/>
+                <w:sz w:val="17"/>
               </w:rPr>
               <w:t>"&gt;="        return GE;</w:t>
               <w:br/>
@@ -6430,7 +7508,7 @@
             <w:r>
               <w:rPr>
                 <w:rFonts w:ascii="Courier New" w:hAnsi="Courier New" w:eastAsia="Courier New"/>
-                <w:sz w:val="18"/>
+                <w:sz w:val="17"/>
               </w:rPr>
               <w:t>"&lt;="        return LE;</w:t>
               <w:br/>
@@ -6438,7 +7516,7 @@
             <w:r>
               <w:rPr>
                 <w:rFonts w:ascii="Courier New" w:hAnsi="Courier New" w:eastAsia="Courier New"/>
-                <w:sz w:val="18"/>
+                <w:sz w:val="17"/>
               </w:rPr>
               <w:t>"=="        return EQ;</w:t>
               <w:br/>
@@ -6446,7 +7524,7 @@
             <w:r>
               <w:rPr>
                 <w:rFonts w:ascii="Courier New" w:hAnsi="Courier New" w:eastAsia="Courier New"/>
-                <w:sz w:val="18"/>
+                <w:sz w:val="17"/>
               </w:rPr>
               <w:t>"!="        return NE;</w:t>
               <w:br/>
@@ -6454,7 +7532,7 @@
             <w:r>
               <w:rPr>
                 <w:rFonts w:ascii="Courier New" w:hAnsi="Courier New" w:eastAsia="Courier New"/>
-                <w:sz w:val="18"/>
+                <w:sz w:val="17"/>
               </w:rPr>
               <w:t>"while"     return WHILE;</w:t>
               <w:br/>
@@ -6462,7 +7540,7 @@
             <w:r>
               <w:rPr>
                 <w:rFonts w:ascii="Courier New" w:hAnsi="Courier New" w:eastAsia="Courier New"/>
-                <w:sz w:val="18"/>
+                <w:sz w:val="17"/>
               </w:rPr>
               <w:t>"if"        return IF;</w:t>
               <w:br/>
@@ -6470,7 +7548,7 @@
             <w:r>
               <w:rPr>
                 <w:rFonts w:ascii="Courier New" w:hAnsi="Courier New" w:eastAsia="Courier New"/>
-                <w:sz w:val="18"/>
+                <w:sz w:val="17"/>
               </w:rPr>
               <w:t>"else"      return ELSE;</w:t>
               <w:br/>
@@ -6478,7 +7556,7 @@
             <w:r>
               <w:rPr>
                 <w:rFonts w:ascii="Courier New" w:hAnsi="Courier New" w:eastAsia="Courier New"/>
-                <w:sz w:val="18"/>
+                <w:sz w:val="17"/>
               </w:rPr>
               <w:t>"print"     return PRINT;</w:t>
               <w:br/>
@@ -6486,14 +7564,14 @@
             <w:r>
               <w:rPr>
                 <w:rFonts w:ascii="Courier New" w:hAnsi="Courier New" w:eastAsia="Courier New"/>
-                <w:sz w:val="18"/>
+                <w:sz w:val="17"/>
               </w:rPr>
               <w:br/>
             </w:r>
             <w:r>
               <w:rPr>
                 <w:rFonts w:ascii="Courier New" w:hAnsi="Courier New" w:eastAsia="Courier New"/>
-                <w:sz w:val="18"/>
+                <w:sz w:val="17"/>
               </w:rPr>
               <w:t>[ \t\n]+    ;</w:t>
               <w:br/>
@@ -6501,14 +7579,14 @@
             <w:r>
               <w:rPr>
                 <w:rFonts w:ascii="Courier New" w:hAnsi="Courier New" w:eastAsia="Courier New"/>
-                <w:sz w:val="18"/>
+                <w:sz w:val="17"/>
               </w:rPr>
               <w:br/>
             </w:r>
             <w:r>
               <w:rPr>
                 <w:rFonts w:ascii="Courier New" w:hAnsi="Courier New" w:eastAsia="Courier New"/>
-                <w:sz w:val="18"/>
+                <w:sz w:val="17"/>
               </w:rPr>
               <w:t>.           yyerror("Unknown character");</w:t>
               <w:br/>
@@ -6516,14 +7594,14 @@
             <w:r>
               <w:rPr>
                 <w:rFonts w:ascii="Courier New" w:hAnsi="Courier New" w:eastAsia="Courier New"/>
-                <w:sz w:val="18"/>
+                <w:sz w:val="17"/>
               </w:rPr>
               <w:br/>
             </w:r>
             <w:r>
               <w:rPr>
                 <w:rFonts w:ascii="Courier New" w:hAnsi="Courier New" w:eastAsia="Courier New"/>
-                <w:sz w:val="18"/>
+                <w:sz w:val="17"/>
               </w:rPr>
               <w:t>%%</w:t>
               <w:br/>
@@ -6531,14 +7609,14 @@
             <w:r>
               <w:rPr>
                 <w:rFonts w:ascii="Courier New" w:hAnsi="Courier New" w:eastAsia="Courier New"/>
-                <w:sz w:val="18"/>
+                <w:sz w:val="17"/>
               </w:rPr>
               <w:br/>
             </w:r>
             <w:r>
               <w:rPr>
                 <w:rFonts w:ascii="Courier New" w:hAnsi="Courier New" w:eastAsia="Courier New"/>
-                <w:sz w:val="18"/>
+                <w:sz w:val="17"/>
               </w:rPr>
               <w:t>int yywrap(void) {</w:t>
               <w:br/>
@@ -6546,7 +7624,7 @@
             <w:r>
               <w:rPr>
                 <w:rFonts w:ascii="Courier New" w:hAnsi="Courier New" w:eastAsia="Courier New"/>
-                <w:sz w:val="18"/>
+                <w:sz w:val="17"/>
               </w:rPr>
               <w:t xml:space="preserve">    return 1;</w:t>
               <w:br/>
@@ -6554,7 +7632,7 @@
             <w:r>
               <w:rPr>
                 <w:rFonts w:ascii="Courier New" w:hAnsi="Courier New" w:eastAsia="Courier New"/>
-                <w:sz w:val="18"/>
+                <w:sz w:val="17"/>
               </w:rPr>
               <w:t>}</w:t>
             </w:r>
@@ -6577,7 +7655,7 @@
           <w:b/>
           <w:sz w:val="21"/>
         </w:rPr>
-        <w:t xml:space="preserve">Table 4: </w:t>
+        <w:t xml:space="preserve">Table 5: </w:t>
       </w:r>
       <w:r>
         <w:rPr>
@@ -7287,7 +8365,7 @@
             <w:r>
               <w:rPr>
                 <w:rFonts w:ascii="Courier New" w:hAnsi="Courier New" w:eastAsia="Courier New"/>
-                <w:sz w:val="18"/>
+                <w:sz w:val="17"/>
               </w:rPr>
               <w:t>%{</w:t>
               <w:br/>
@@ -7295,7 +8373,7 @@
             <w:r>
               <w:rPr>
                 <w:rFonts w:ascii="Courier New" w:hAnsi="Courier New" w:eastAsia="Courier New"/>
-                <w:sz w:val="18"/>
+                <w:sz w:val="17"/>
               </w:rPr>
               <w:t>#include &lt;stdio.h&gt;</w:t>
               <w:br/>
@@ -7303,7 +8381,7 @@
             <w:r>
               <w:rPr>
                 <w:rFonts w:ascii="Courier New" w:hAnsi="Courier New" w:eastAsia="Courier New"/>
-                <w:sz w:val="18"/>
+                <w:sz w:val="17"/>
               </w:rPr>
               <w:t>#include &lt;stdlib.h&gt;</w:t>
               <w:br/>
@@ -7311,7 +8389,7 @@
             <w:r>
               <w:rPr>
                 <w:rFonts w:ascii="Courier New" w:hAnsi="Courier New" w:eastAsia="Courier New"/>
-                <w:sz w:val="18"/>
+                <w:sz w:val="17"/>
               </w:rPr>
               <w:t>#include &lt;stdarg.h&gt;</w:t>
               <w:br/>
@@ -7319,7 +8397,7 @@
             <w:r>
               <w:rPr>
                 <w:rFonts w:ascii="Courier New" w:hAnsi="Courier New" w:eastAsia="Courier New"/>
-                <w:sz w:val="18"/>
+                <w:sz w:val="17"/>
               </w:rPr>
               <w:t>#include "calc3.h"</w:t>
               <w:br/>
@@ -7327,14 +8405,14 @@
             <w:r>
               <w:rPr>
                 <w:rFonts w:ascii="Courier New" w:hAnsi="Courier New" w:eastAsia="Courier New"/>
-                <w:sz w:val="18"/>
+                <w:sz w:val="17"/>
               </w:rPr>
               <w:br/>
             </w:r>
             <w:r>
               <w:rPr>
                 <w:rFonts w:ascii="Courier New" w:hAnsi="Courier New" w:eastAsia="Courier New"/>
-                <w:sz w:val="18"/>
+                <w:sz w:val="17"/>
               </w:rPr>
               <w:t>nodeType *opr(int oper, int nops, ...);</w:t>
               <w:br/>
@@ -7342,7 +8420,7 @@
             <w:r>
               <w:rPr>
                 <w:rFonts w:ascii="Courier New" w:hAnsi="Courier New" w:eastAsia="Courier New"/>
-                <w:sz w:val="18"/>
+                <w:sz w:val="17"/>
               </w:rPr>
               <w:t>nodeType *id(int i);</w:t>
               <w:br/>
@@ -7350,7 +8428,7 @@
             <w:r>
               <w:rPr>
                 <w:rFonts w:ascii="Courier New" w:hAnsi="Courier New" w:eastAsia="Courier New"/>
-                <w:sz w:val="18"/>
+                <w:sz w:val="17"/>
               </w:rPr>
               <w:t>nodeType *con(int value);</w:t>
               <w:br/>
@@ -7358,7 +8436,7 @@
             <w:r>
               <w:rPr>
                 <w:rFonts w:ascii="Courier New" w:hAnsi="Courier New" w:eastAsia="Courier New"/>
-                <w:sz w:val="18"/>
+                <w:sz w:val="17"/>
               </w:rPr>
               <w:t>void freeNode(nodeType *p);</w:t>
               <w:br/>
@@ -7366,7 +8444,7 @@
             <w:r>
               <w:rPr>
                 <w:rFonts w:ascii="Courier New" w:hAnsi="Courier New" w:eastAsia="Courier New"/>
-                <w:sz w:val="18"/>
+                <w:sz w:val="17"/>
               </w:rPr>
               <w:t>int ex(nodeType *p);</w:t>
               <w:br/>
@@ -7374,7 +8452,7 @@
             <w:r>
               <w:rPr>
                 <w:rFonts w:ascii="Courier New" w:hAnsi="Courier New" w:eastAsia="Courier New"/>
-                <w:sz w:val="18"/>
+                <w:sz w:val="17"/>
               </w:rPr>
               <w:t>int yylex(void);</w:t>
               <w:br/>
@@ -7382,14 +8460,14 @@
             <w:r>
               <w:rPr>
                 <w:rFonts w:ascii="Courier New" w:hAnsi="Courier New" w:eastAsia="Courier New"/>
-                <w:sz w:val="18"/>
+                <w:sz w:val="17"/>
               </w:rPr>
               <w:br/>
             </w:r>
             <w:r>
               <w:rPr>
                 <w:rFonts w:ascii="Courier New" w:hAnsi="Courier New" w:eastAsia="Courier New"/>
-                <w:sz w:val="18"/>
+                <w:sz w:val="17"/>
               </w:rPr>
               <w:t>void yyerror(char *s);</w:t>
               <w:br/>
@@ -7397,7 +8475,7 @@
             <w:r>
               <w:rPr>
                 <w:rFonts w:ascii="Courier New" w:hAnsi="Courier New" w:eastAsia="Courier New"/>
-                <w:sz w:val="18"/>
+                <w:sz w:val="17"/>
               </w:rPr>
               <w:t>int sym[26];</w:t>
               <w:br/>
@@ -7405,7 +8483,7 @@
             <w:r>
               <w:rPr>
                 <w:rFonts w:ascii="Courier New" w:hAnsi="Courier New" w:eastAsia="Courier New"/>
-                <w:sz w:val="18"/>
+                <w:sz w:val="17"/>
               </w:rPr>
               <w:t>%}</w:t>
               <w:br/>
@@ -7413,14 +8491,14 @@
             <w:r>
               <w:rPr>
                 <w:rFonts w:ascii="Courier New" w:hAnsi="Courier New" w:eastAsia="Courier New"/>
-                <w:sz w:val="18"/>
+                <w:sz w:val="17"/>
               </w:rPr>
               <w:br/>
             </w:r>
             <w:r>
               <w:rPr>
                 <w:rFonts w:ascii="Courier New" w:hAnsi="Courier New" w:eastAsia="Courier New"/>
-                <w:sz w:val="18"/>
+                <w:sz w:val="17"/>
               </w:rPr>
               <w:t>%union {</w:t>
               <w:br/>
@@ -7428,7 +8506,7 @@
             <w:r>
               <w:rPr>
                 <w:rFonts w:ascii="Courier New" w:hAnsi="Courier New" w:eastAsia="Courier New"/>
-                <w:sz w:val="18"/>
+                <w:sz w:val="17"/>
               </w:rPr>
               <w:t xml:space="preserve">    int iValue;</w:t>
               <w:br/>
@@ -7436,7 +8514,7 @@
             <w:r>
               <w:rPr>
                 <w:rFonts w:ascii="Courier New" w:hAnsi="Courier New" w:eastAsia="Courier New"/>
-                <w:sz w:val="18"/>
+                <w:sz w:val="17"/>
               </w:rPr>
               <w:t xml:space="preserve">    char sIndex;</w:t>
               <w:br/>
@@ -7444,7 +8522,7 @@
             <w:r>
               <w:rPr>
                 <w:rFonts w:ascii="Courier New" w:hAnsi="Courier New" w:eastAsia="Courier New"/>
-                <w:sz w:val="18"/>
+                <w:sz w:val="17"/>
               </w:rPr>
               <w:t xml:space="preserve">    nodeType *nPtr;</w:t>
               <w:br/>
@@ -7452,7 +8530,7 @@
             <w:r>
               <w:rPr>
                 <w:rFonts w:ascii="Courier New" w:hAnsi="Courier New" w:eastAsia="Courier New"/>
-                <w:sz w:val="18"/>
+                <w:sz w:val="17"/>
               </w:rPr>
               <w:t>};</w:t>
               <w:br/>
@@ -7460,14 +8538,14 @@
             <w:r>
               <w:rPr>
                 <w:rFonts w:ascii="Courier New" w:hAnsi="Courier New" w:eastAsia="Courier New"/>
-                <w:sz w:val="18"/>
+                <w:sz w:val="17"/>
               </w:rPr>
               <w:br/>
             </w:r>
             <w:r>
               <w:rPr>
                 <w:rFonts w:ascii="Courier New" w:hAnsi="Courier New" w:eastAsia="Courier New"/>
-                <w:sz w:val="18"/>
+                <w:sz w:val="17"/>
               </w:rPr>
               <w:t>%token &lt;iValue&gt; INTEGER</w:t>
               <w:br/>
@@ -7475,7 +8553,7 @@
             <w:r>
               <w:rPr>
                 <w:rFonts w:ascii="Courier New" w:hAnsi="Courier New" w:eastAsia="Courier New"/>
-                <w:sz w:val="18"/>
+                <w:sz w:val="17"/>
               </w:rPr>
               <w:t>%token &lt;sIndex&gt; VARIABLE</w:t>
               <w:br/>
@@ -7483,7 +8561,7 @@
             <w:r>
               <w:rPr>
                 <w:rFonts w:ascii="Courier New" w:hAnsi="Courier New" w:eastAsia="Courier New"/>
-                <w:sz w:val="18"/>
+                <w:sz w:val="17"/>
               </w:rPr>
               <w:t>%token WHILE IF PRINT</w:t>
               <w:br/>
@@ -7491,7 +8569,7 @@
             <w:r>
               <w:rPr>
                 <w:rFonts w:ascii="Courier New" w:hAnsi="Courier New" w:eastAsia="Courier New"/>
-                <w:sz w:val="18"/>
+                <w:sz w:val="17"/>
               </w:rPr>
               <w:t>%nonassoc IFX</w:t>
               <w:br/>
@@ -7499,7 +8577,7 @@
             <w:r>
               <w:rPr>
                 <w:rFonts w:ascii="Courier New" w:hAnsi="Courier New" w:eastAsia="Courier New"/>
-                <w:sz w:val="18"/>
+                <w:sz w:val="17"/>
               </w:rPr>
               <w:t>%nonassoc ELSE</w:t>
               <w:br/>
@@ -7507,14 +8585,14 @@
             <w:r>
               <w:rPr>
                 <w:rFonts w:ascii="Courier New" w:hAnsi="Courier New" w:eastAsia="Courier New"/>
-                <w:sz w:val="18"/>
+                <w:sz w:val="17"/>
               </w:rPr>
               <w:br/>
             </w:r>
             <w:r>
               <w:rPr>
                 <w:rFonts w:ascii="Courier New" w:hAnsi="Courier New" w:eastAsia="Courier New"/>
-                <w:sz w:val="18"/>
+                <w:sz w:val="17"/>
               </w:rPr>
               <w:t>%left GE LE EQ NE '&gt;' '&lt;'</w:t>
               <w:br/>
@@ -7522,7 +8600,7 @@
             <w:r>
               <w:rPr>
                 <w:rFonts w:ascii="Courier New" w:hAnsi="Courier New" w:eastAsia="Courier New"/>
-                <w:sz w:val="18"/>
+                <w:sz w:val="17"/>
               </w:rPr>
               <w:t>%left '+' '-'</w:t>
               <w:br/>
@@ -7530,7 +8608,7 @@
             <w:r>
               <w:rPr>
                 <w:rFonts w:ascii="Courier New" w:hAnsi="Courier New" w:eastAsia="Courier New"/>
-                <w:sz w:val="18"/>
+                <w:sz w:val="17"/>
               </w:rPr>
               <w:t>%left '*' '/'</w:t>
               <w:br/>
@@ -7538,7 +8616,7 @@
             <w:r>
               <w:rPr>
                 <w:rFonts w:ascii="Courier New" w:hAnsi="Courier New" w:eastAsia="Courier New"/>
-                <w:sz w:val="18"/>
+                <w:sz w:val="17"/>
               </w:rPr>
               <w:t>%nonassoc UMINUS</w:t>
               <w:br/>
@@ -7546,14 +8624,14 @@
             <w:r>
               <w:rPr>
                 <w:rFonts w:ascii="Courier New" w:hAnsi="Courier New" w:eastAsia="Courier New"/>
-                <w:sz w:val="18"/>
+                <w:sz w:val="17"/>
               </w:rPr>
               <w:br/>
             </w:r>
             <w:r>
               <w:rPr>
                 <w:rFonts w:ascii="Courier New" w:hAnsi="Courier New" w:eastAsia="Courier New"/>
-                <w:sz w:val="18"/>
+                <w:sz w:val="17"/>
               </w:rPr>
               <w:t>%type &lt;nPtr&gt; stmt expr stmt_list</w:t>
               <w:br/>
@@ -7561,14 +8639,14 @@
             <w:r>
               <w:rPr>
                 <w:rFonts w:ascii="Courier New" w:hAnsi="Courier New" w:eastAsia="Courier New"/>
-                <w:sz w:val="18"/>
+                <w:sz w:val="17"/>
               </w:rPr>
               <w:br/>
             </w:r>
             <w:r>
               <w:rPr>
                 <w:rFonts w:ascii="Courier New" w:hAnsi="Courier New" w:eastAsia="Courier New"/>
-                <w:sz w:val="18"/>
+                <w:sz w:val="17"/>
               </w:rPr>
               <w:t>%%</w:t>
               <w:br/>
@@ -7576,14 +8654,14 @@
             <w:r>
               <w:rPr>
                 <w:rFonts w:ascii="Courier New" w:hAnsi="Courier New" w:eastAsia="Courier New"/>
-                <w:sz w:val="18"/>
+                <w:sz w:val="17"/>
               </w:rPr>
               <w:br/>
             </w:r>
             <w:r>
               <w:rPr>
                 <w:rFonts w:ascii="Courier New" w:hAnsi="Courier New" w:eastAsia="Courier New"/>
-                <w:sz w:val="18"/>
+                <w:sz w:val="17"/>
               </w:rPr>
               <w:t>program:</w:t>
               <w:br/>
@@ -7591,7 +8669,7 @@
             <w:r>
               <w:rPr>
                 <w:rFonts w:ascii="Courier New" w:hAnsi="Courier New" w:eastAsia="Courier New"/>
-                <w:sz w:val="18"/>
+                <w:sz w:val="17"/>
               </w:rPr>
               <w:t xml:space="preserve">        function                { exit(0); }</w:t>
               <w:br/>
@@ -7599,7 +8677,7 @@
             <w:r>
               <w:rPr>
                 <w:rFonts w:ascii="Courier New" w:hAnsi="Courier New" w:eastAsia="Courier New"/>
-                <w:sz w:val="18"/>
+                <w:sz w:val="17"/>
               </w:rPr>
               <w:t xml:space="preserve">        ;</w:t>
               <w:br/>
@@ -7607,14 +8685,14 @@
             <w:r>
               <w:rPr>
                 <w:rFonts w:ascii="Courier New" w:hAnsi="Courier New" w:eastAsia="Courier New"/>
-                <w:sz w:val="18"/>
+                <w:sz w:val="17"/>
               </w:rPr>
               <w:br/>
             </w:r>
             <w:r>
               <w:rPr>
                 <w:rFonts w:ascii="Courier New" w:hAnsi="Courier New" w:eastAsia="Courier New"/>
-                <w:sz w:val="18"/>
+                <w:sz w:val="17"/>
               </w:rPr>
               <w:t>function:</w:t>
               <w:br/>
@@ -7622,7 +8700,7 @@
             <w:r>
               <w:rPr>
                 <w:rFonts w:ascii="Courier New" w:hAnsi="Courier New" w:eastAsia="Courier New"/>
-                <w:sz w:val="18"/>
+                <w:sz w:val="17"/>
               </w:rPr>
               <w:t xml:space="preserve">          function stmt         { ex($2); freeNode($2); }</w:t>
               <w:br/>
@@ -7630,7 +8708,7 @@
             <w:r>
               <w:rPr>
                 <w:rFonts w:ascii="Courier New" w:hAnsi="Courier New" w:eastAsia="Courier New"/>
-                <w:sz w:val="18"/>
+                <w:sz w:val="17"/>
               </w:rPr>
               <w:t xml:space="preserve">        |</w:t>
               <w:br/>
@@ -7638,7 +8716,7 @@
             <w:r>
               <w:rPr>
                 <w:rFonts w:ascii="Courier New" w:hAnsi="Courier New" w:eastAsia="Courier New"/>
-                <w:sz w:val="18"/>
+                <w:sz w:val="17"/>
               </w:rPr>
               <w:t xml:space="preserve">        ;</w:t>
               <w:br/>
@@ -7646,14 +8724,14 @@
             <w:r>
               <w:rPr>
                 <w:rFonts w:ascii="Courier New" w:hAnsi="Courier New" w:eastAsia="Courier New"/>
-                <w:sz w:val="18"/>
+                <w:sz w:val="17"/>
               </w:rPr>
               <w:br/>
             </w:r>
             <w:r>
               <w:rPr>
                 <w:rFonts w:ascii="Courier New" w:hAnsi="Courier New" w:eastAsia="Courier New"/>
-                <w:sz w:val="18"/>
+                <w:sz w:val="17"/>
               </w:rPr>
               <w:t>stmt:</w:t>
               <w:br/>
@@ -7661,7 +8739,7 @@
             <w:r>
               <w:rPr>
                 <w:rFonts w:ascii="Courier New" w:hAnsi="Courier New" w:eastAsia="Courier New"/>
-                <w:sz w:val="18"/>
+                <w:sz w:val="17"/>
               </w:rPr>
               <w:t xml:space="preserve">          ';'                            { $$ = opr(';', 2, NULL, NULL); }</w:t>
               <w:br/>
@@ -7669,7 +8747,7 @@
             <w:r>
               <w:rPr>
                 <w:rFonts w:ascii="Courier New" w:hAnsi="Courier New" w:eastAsia="Courier New"/>
-                <w:sz w:val="18"/>
+                <w:sz w:val="17"/>
               </w:rPr>
               <w:t xml:space="preserve">        | expr ';'                       { $$ = $1; }</w:t>
               <w:br/>
@@ -7677,7 +8755,7 @@
             <w:r>
               <w:rPr>
                 <w:rFonts w:ascii="Courier New" w:hAnsi="Courier New" w:eastAsia="Courier New"/>
-                <w:sz w:val="18"/>
+                <w:sz w:val="17"/>
               </w:rPr>
               <w:t xml:space="preserve">        | PRINT expr ';'                 { $$ = opr(PRINT, 1, $2); }</w:t>
               <w:br/>
@@ -7685,7 +8763,7 @@
             <w:r>
               <w:rPr>
                 <w:rFonts w:ascii="Courier New" w:hAnsi="Courier New" w:eastAsia="Courier New"/>
-                <w:sz w:val="18"/>
+                <w:sz w:val="17"/>
               </w:rPr>
               <w:t xml:space="preserve">        | VARIABLE '=' expr ';'          { $$ = opr('=', 2, id($1), $3); }</w:t>
               <w:br/>
@@ -7693,7 +8771,7 @@
             <w:r>
               <w:rPr>
                 <w:rFonts w:ascii="Courier New" w:hAnsi="Courier New" w:eastAsia="Courier New"/>
-                <w:sz w:val="18"/>
+                <w:sz w:val="17"/>
               </w:rPr>
               <w:t xml:space="preserve">        | WHILE '(' expr ')' stmt        { $$ = opr(WHILE, 2, $3, $5); }</w:t>
               <w:br/>
@@ -7701,7 +8779,7 @@
             <w:r>
               <w:rPr>
                 <w:rFonts w:ascii="Courier New" w:hAnsi="Courier New" w:eastAsia="Courier New"/>
-                <w:sz w:val="18"/>
+                <w:sz w:val="17"/>
               </w:rPr>
               <w:t xml:space="preserve">        | IF '(' expr ')' stmt %prec IFX { $$ = opr(IF, 2, $3, $5); }</w:t>
               <w:br/>
@@ -7709,7 +8787,7 @@
             <w:r>
               <w:rPr>
                 <w:rFonts w:ascii="Courier New" w:hAnsi="Courier New" w:eastAsia="Courier New"/>
-                <w:sz w:val="18"/>
+                <w:sz w:val="17"/>
               </w:rPr>
               <w:t xml:space="preserve">        | IF '(' expr ')' stmt ELSE stmt { $$ = opr(IF, 3, $3, $5, $7); }</w:t>
               <w:br/>
@@ -7717,7 +8795,7 @@
             <w:r>
               <w:rPr>
                 <w:rFonts w:ascii="Courier New" w:hAnsi="Courier New" w:eastAsia="Courier New"/>
-                <w:sz w:val="18"/>
+                <w:sz w:val="17"/>
               </w:rPr>
               <w:t xml:space="preserve">        | '{' stmt_list '}'              { $$ = $2; }</w:t>
               <w:br/>
@@ -7725,7 +8803,7 @@
             <w:r>
               <w:rPr>
                 <w:rFonts w:ascii="Courier New" w:hAnsi="Courier New" w:eastAsia="Courier New"/>
-                <w:sz w:val="18"/>
+                <w:sz w:val="17"/>
               </w:rPr>
               <w:t xml:space="preserve">        ;</w:t>
               <w:br/>
@@ -7733,14 +8811,14 @@
             <w:r>
               <w:rPr>
                 <w:rFonts w:ascii="Courier New" w:hAnsi="Courier New" w:eastAsia="Courier New"/>
-                <w:sz w:val="18"/>
+                <w:sz w:val="17"/>
               </w:rPr>
               <w:br/>
             </w:r>
             <w:r>
               <w:rPr>
                 <w:rFonts w:ascii="Courier New" w:hAnsi="Courier New" w:eastAsia="Courier New"/>
-                <w:sz w:val="18"/>
+                <w:sz w:val="17"/>
               </w:rPr>
               <w:t>stmt_list:</w:t>
               <w:br/>
@@ -7748,7 +8826,7 @@
             <w:r>
               <w:rPr>
                 <w:rFonts w:ascii="Courier New" w:hAnsi="Courier New" w:eastAsia="Courier New"/>
-                <w:sz w:val="18"/>
+                <w:sz w:val="17"/>
               </w:rPr>
               <w:t xml:space="preserve">          stmt                  { $$ = $1; }</w:t>
               <w:br/>
@@ -7756,7 +8834,7 @@
             <w:r>
               <w:rPr>
                 <w:rFonts w:ascii="Courier New" w:hAnsi="Courier New" w:eastAsia="Courier New"/>
-                <w:sz w:val="18"/>
+                <w:sz w:val="17"/>
               </w:rPr>
               <w:t xml:space="preserve">        | stmt_list stmt        { $$ = opr(';', 2, $1, $2); }</w:t>
               <w:br/>
@@ -7764,7 +8842,7 @@
             <w:r>
               <w:rPr>
                 <w:rFonts w:ascii="Courier New" w:hAnsi="Courier New" w:eastAsia="Courier New"/>
-                <w:sz w:val="18"/>
+                <w:sz w:val="17"/>
               </w:rPr>
               <w:t xml:space="preserve">        ;</w:t>
               <w:br/>
@@ -7772,14 +8850,14 @@
             <w:r>
               <w:rPr>
                 <w:rFonts w:ascii="Courier New" w:hAnsi="Courier New" w:eastAsia="Courier New"/>
-                <w:sz w:val="18"/>
+                <w:sz w:val="17"/>
               </w:rPr>
               <w:br/>
             </w:r>
             <w:r>
               <w:rPr>
                 <w:rFonts w:ascii="Courier New" w:hAnsi="Courier New" w:eastAsia="Courier New"/>
-                <w:sz w:val="18"/>
+                <w:sz w:val="17"/>
               </w:rPr>
               <w:t>expr:</w:t>
               <w:br/>
@@ -7787,7 +8865,7 @@
             <w:r>
               <w:rPr>
                 <w:rFonts w:ascii="Courier New" w:hAnsi="Courier New" w:eastAsia="Courier New"/>
-                <w:sz w:val="18"/>
+                <w:sz w:val="17"/>
               </w:rPr>
               <w:t xml:space="preserve">          INTEGER               { $$ = con($1); }</w:t>
               <w:br/>
@@ -7795,7 +8873,7 @@
             <w:r>
               <w:rPr>
                 <w:rFonts w:ascii="Courier New" w:hAnsi="Courier New" w:eastAsia="Courier New"/>
-                <w:sz w:val="18"/>
+                <w:sz w:val="17"/>
               </w:rPr>
               <w:t xml:space="preserve">        | VARIABLE              { $$ = id($1); }</w:t>
               <w:br/>
@@ -7803,7 +8881,7 @@
             <w:r>
               <w:rPr>
                 <w:rFonts w:ascii="Courier New" w:hAnsi="Courier New" w:eastAsia="Courier New"/>
-                <w:sz w:val="18"/>
+                <w:sz w:val="17"/>
               </w:rPr>
               <w:t xml:space="preserve">        | '-' expr %prec UMINUS { $$ = opr(UMINUS, 1, $2); }</w:t>
               <w:br/>
@@ -7811,7 +8889,7 @@
             <w:r>
               <w:rPr>
                 <w:rFonts w:ascii="Courier New" w:hAnsi="Courier New" w:eastAsia="Courier New"/>
-                <w:sz w:val="18"/>
+                <w:sz w:val="17"/>
               </w:rPr>
               <w:t xml:space="preserve">        | expr '+' expr         { $$ = opr('+', 2, $1, $3); }</w:t>
               <w:br/>
@@ -7819,7 +8897,7 @@
             <w:r>
               <w:rPr>
                 <w:rFonts w:ascii="Courier New" w:hAnsi="Courier New" w:eastAsia="Courier New"/>
-                <w:sz w:val="18"/>
+                <w:sz w:val="17"/>
               </w:rPr>
               <w:t xml:space="preserve">        | expr '-' expr         { $$ = opr('-', 2, $1, $3); }</w:t>
               <w:br/>
@@ -7827,7 +8905,7 @@
             <w:r>
               <w:rPr>
                 <w:rFonts w:ascii="Courier New" w:hAnsi="Courier New" w:eastAsia="Courier New"/>
-                <w:sz w:val="18"/>
+                <w:sz w:val="17"/>
               </w:rPr>
               <w:t xml:space="preserve">        | expr '*' expr         { $$ = opr('*', 2, $1, $3); }</w:t>
               <w:br/>
@@ -7835,7 +8913,7 @@
             <w:r>
               <w:rPr>
                 <w:rFonts w:ascii="Courier New" w:hAnsi="Courier New" w:eastAsia="Courier New"/>
-                <w:sz w:val="18"/>
+                <w:sz w:val="17"/>
               </w:rPr>
               <w:t xml:space="preserve">        | expr '/' expr         { $$ = opr('/', 2, $1, $3); }</w:t>
               <w:br/>
@@ -7843,7 +8921,7 @@
             <w:r>
               <w:rPr>
                 <w:rFonts w:ascii="Courier New" w:hAnsi="Courier New" w:eastAsia="Courier New"/>
-                <w:sz w:val="18"/>
+                <w:sz w:val="17"/>
               </w:rPr>
               <w:t xml:space="preserve">        | expr '&lt;' expr         { $$ = opr('&lt;', 2, $1, $3); }</w:t>
               <w:br/>
@@ -7851,7 +8929,7 @@
             <w:r>
               <w:rPr>
                 <w:rFonts w:ascii="Courier New" w:hAnsi="Courier New" w:eastAsia="Courier New"/>
-                <w:sz w:val="18"/>
+                <w:sz w:val="17"/>
               </w:rPr>
               <w:t xml:space="preserve">        | expr '&gt;' expr         { $$ = opr('&gt;', 2, $1, $3); }</w:t>
               <w:br/>
@@ -7859,7 +8937,7 @@
             <w:r>
               <w:rPr>
                 <w:rFonts w:ascii="Courier New" w:hAnsi="Courier New" w:eastAsia="Courier New"/>
-                <w:sz w:val="18"/>
+                <w:sz w:val="17"/>
               </w:rPr>
               <w:t xml:space="preserve">        | expr GE expr          { $$ = opr(GE, 2, $1, $3); }</w:t>
               <w:br/>
@@ -7867,7 +8945,7 @@
             <w:r>
               <w:rPr>
                 <w:rFonts w:ascii="Courier New" w:hAnsi="Courier New" w:eastAsia="Courier New"/>
-                <w:sz w:val="18"/>
+                <w:sz w:val="17"/>
               </w:rPr>
               <w:t xml:space="preserve">        | expr LE expr          { $$ = opr(LE, 2, $1, $3); }</w:t>
               <w:br/>
@@ -7875,7 +8953,7 @@
             <w:r>
               <w:rPr>
                 <w:rFonts w:ascii="Courier New" w:hAnsi="Courier New" w:eastAsia="Courier New"/>
-                <w:sz w:val="18"/>
+                <w:sz w:val="17"/>
               </w:rPr>
               <w:t xml:space="preserve">        | expr NE expr          { $$ = opr(NE, 2, $1, $3); }</w:t>
               <w:br/>
@@ -7883,7 +8961,7 @@
             <w:r>
               <w:rPr>
                 <w:rFonts w:ascii="Courier New" w:hAnsi="Courier New" w:eastAsia="Courier New"/>
-                <w:sz w:val="18"/>
+                <w:sz w:val="17"/>
               </w:rPr>
               <w:t xml:space="preserve">        | expr EQ expr          { $$ = opr(EQ, 2, $1, $3); }</w:t>
               <w:br/>
@@ -7891,7 +8969,7 @@
             <w:r>
               <w:rPr>
                 <w:rFonts w:ascii="Courier New" w:hAnsi="Courier New" w:eastAsia="Courier New"/>
-                <w:sz w:val="18"/>
+                <w:sz w:val="17"/>
               </w:rPr>
               <w:t xml:space="preserve">        | '(' expr ')'          { $$ = $2; }</w:t>
               <w:br/>
@@ -7899,7 +8977,7 @@
             <w:r>
               <w:rPr>
                 <w:rFonts w:ascii="Courier New" w:hAnsi="Courier New" w:eastAsia="Courier New"/>
-                <w:sz w:val="18"/>
+                <w:sz w:val="17"/>
               </w:rPr>
               <w:t xml:space="preserve">        ;</w:t>
               <w:br/>
@@ -7907,14 +8985,14 @@
             <w:r>
               <w:rPr>
                 <w:rFonts w:ascii="Courier New" w:hAnsi="Courier New" w:eastAsia="Courier New"/>
-                <w:sz w:val="18"/>
+                <w:sz w:val="17"/>
               </w:rPr>
               <w:br/>
             </w:r>
             <w:r>
               <w:rPr>
                 <w:rFonts w:ascii="Courier New" w:hAnsi="Courier New" w:eastAsia="Courier New"/>
-                <w:sz w:val="18"/>
+                <w:sz w:val="17"/>
               </w:rPr>
               <w:t>%%</w:t>
               <w:br/>
@@ -7922,7 +9000,7 @@
             <w:r>
               <w:rPr>
                 <w:rFonts w:ascii="Courier New" w:hAnsi="Courier New" w:eastAsia="Courier New"/>
-                <w:sz w:val="18"/>
+                <w:sz w:val="17"/>
               </w:rPr>
               <w:t>...</w:t>
             </w:r>
@@ -8158,7 +9236,7 @@
             <w:r>
               <w:rPr>
                 <w:rFonts w:ascii="Courier New" w:hAnsi="Courier New" w:eastAsia="Courier New"/>
-                <w:sz w:val="18"/>
+                <w:sz w:val="17"/>
               </w:rPr>
               <w:t>&lt;program&gt;   ::= &lt;function&gt;</w:t>
               <w:br/>
@@ -8166,7 +9244,7 @@
             <w:r>
               <w:rPr>
                 <w:rFonts w:ascii="Courier New" w:hAnsi="Courier New" w:eastAsia="Courier New"/>
-                <w:sz w:val="18"/>
+                <w:sz w:val="17"/>
               </w:rPr>
               <w:t>&lt;function&gt;  ::= &lt;function&gt; &lt;stmt&gt;  |  ε</w:t>
               <w:br/>
@@ -8174,7 +9252,7 @@
             <w:r>
               <w:rPr>
                 <w:rFonts w:ascii="Courier New" w:hAnsi="Courier New" w:eastAsia="Courier New"/>
-                <w:sz w:val="18"/>
+                <w:sz w:val="17"/>
               </w:rPr>
               <w:t>&lt;stmt&gt;      ::= ';' | &lt;expr&gt; ';' | PRINT &lt;expr&gt; ';' | VARIABLE '=' &lt;expr&gt; ';'</w:t>
               <w:br/>
@@ -8182,7 +9260,7 @@
             <w:r>
               <w:rPr>
                 <w:rFonts w:ascii="Courier New" w:hAnsi="Courier New" w:eastAsia="Courier New"/>
-                <w:sz w:val="18"/>
+                <w:sz w:val="17"/>
               </w:rPr>
               <w:t xml:space="preserve">              | WHILE '(' &lt;expr&gt; ')' &lt;stmt&gt;</w:t>
               <w:br/>
@@ -8190,7 +9268,7 @@
             <w:r>
               <w:rPr>
                 <w:rFonts w:ascii="Courier New" w:hAnsi="Courier New" w:eastAsia="Courier New"/>
-                <w:sz w:val="18"/>
+                <w:sz w:val="17"/>
               </w:rPr>
               <w:t xml:space="preserve">              | IF '(' &lt;expr&gt; ')' &lt;stmt&gt;</w:t>
               <w:br/>
@@ -8198,7 +9276,7 @@
             <w:r>
               <w:rPr>
                 <w:rFonts w:ascii="Courier New" w:hAnsi="Courier New" w:eastAsia="Courier New"/>
-                <w:sz w:val="18"/>
+                <w:sz w:val="17"/>
               </w:rPr>
               <w:t xml:space="preserve">              | IF '(' &lt;expr&gt; ')' &lt;stmt&gt; ELSE &lt;stmt&gt;</w:t>
               <w:br/>
@@ -8206,7 +9284,7 @@
             <w:r>
               <w:rPr>
                 <w:rFonts w:ascii="Courier New" w:hAnsi="Courier New" w:eastAsia="Courier New"/>
-                <w:sz w:val="18"/>
+                <w:sz w:val="17"/>
               </w:rPr>
               <w:t xml:space="preserve">              | '{' &lt;stmt_list&gt; '}'</w:t>
               <w:br/>
@@ -8214,7 +9292,7 @@
             <w:r>
               <w:rPr>
                 <w:rFonts w:ascii="Courier New" w:hAnsi="Courier New" w:eastAsia="Courier New"/>
-                <w:sz w:val="18"/>
+                <w:sz w:val="17"/>
               </w:rPr>
               <w:t>&lt;stmt_list&gt; ::= &lt;stmt&gt;  |  &lt;stmt_list&gt; &lt;stmt&gt;</w:t>
               <w:br/>
@@ -8222,7 +9300,7 @@
             <w:r>
               <w:rPr>
                 <w:rFonts w:ascii="Courier New" w:hAnsi="Courier New" w:eastAsia="Courier New"/>
-                <w:sz w:val="18"/>
+                <w:sz w:val="17"/>
               </w:rPr>
               <w:t>&lt;expr&gt;      ::= INTEGER | VARIABLE | '-' &lt;expr&gt; | '(' &lt;expr&gt; ')'</w:t>
               <w:br/>
@@ -8230,7 +9308,7 @@
             <w:r>
               <w:rPr>
                 <w:rFonts w:ascii="Courier New" w:hAnsi="Courier New" w:eastAsia="Courier New"/>
-                <w:sz w:val="18"/>
+                <w:sz w:val="17"/>
               </w:rPr>
               <w:t xml:space="preserve">              | &lt;expr&gt; &lt;op&gt; &lt;expr&gt;</w:t>
               <w:br/>
@@ -8238,7 +9316,7 @@
             <w:r>
               <w:rPr>
                 <w:rFonts w:ascii="Courier New" w:hAnsi="Courier New" w:eastAsia="Courier New"/>
-                <w:sz w:val="18"/>
+                <w:sz w:val="17"/>
               </w:rPr>
               <w:t>&lt;op&gt;        ::= '+' | '-' | '*' | '/' | '&lt;' | '&gt;' | GE | LE | NE | EQ</w:t>
             </w:r>
@@ -8261,7 +9339,7 @@
           <w:b/>
           <w:sz w:val="21"/>
         </w:rPr>
-        <w:t xml:space="preserve">Table 5: </w:t>
+        <w:t xml:space="preserve">Table 6: </w:t>
       </w:r>
       <w:r>
         <w:rPr>
@@ -9407,7 +10485,7 @@
             <w:r>
               <w:rPr>
                 <w:rFonts w:ascii="Courier New" w:hAnsi="Courier New" w:eastAsia="Courier New"/>
-                <w:sz w:val="18"/>
+                <w:sz w:val="17"/>
               </w:rPr>
               <w:t>%option yylineno</w:t>
               <w:br/>
@@ -9415,7 +10493,7 @@
             <w:r>
               <w:rPr>
                 <w:rFonts w:ascii="Courier New" w:hAnsi="Courier New" w:eastAsia="Courier New"/>
-                <w:sz w:val="18"/>
+                <w:sz w:val="17"/>
               </w:rPr>
               <w:t>...</w:t>
               <w:br/>
@@ -9423,7 +10501,7 @@
             <w:r>
               <w:rPr>
                 <w:rFonts w:ascii="Courier New" w:hAnsi="Courier New" w:eastAsia="Courier New"/>
-                <w:sz w:val="18"/>
+                <w:sz w:val="17"/>
               </w:rPr>
               <w:t>[-()&lt;&gt;=+*/%^;{}.] {</w:t>
               <w:br/>
@@ -9431,7 +10509,7 @@
             <w:r>
               <w:rPr>
                 <w:rFonts w:ascii="Courier New" w:hAnsi="Courier New" w:eastAsia="Courier New"/>
-                <w:sz w:val="18"/>
+                <w:sz w:val="17"/>
               </w:rPr>
               <w:t xml:space="preserve">                return *yytext;</w:t>
               <w:br/>
@@ -9439,7 +10517,7 @@
             <w:r>
               <w:rPr>
                 <w:rFonts w:ascii="Courier New" w:hAnsi="Courier New" w:eastAsia="Courier New"/>
-                <w:sz w:val="18"/>
+                <w:sz w:val="17"/>
               </w:rPr>
               <w:t xml:space="preserve">            }</w:t>
               <w:br/>
@@ -9447,7 +10525,7 @@
             <w:r>
               <w:rPr>
                 <w:rFonts w:ascii="Courier New" w:hAnsi="Courier New" w:eastAsia="Courier New"/>
-                <w:sz w:val="18"/>
+                <w:sz w:val="17"/>
               </w:rPr>
               <w:t>...</w:t>
               <w:br/>
@@ -9455,7 +10533,7 @@
             <w:r>
               <w:rPr>
                 <w:rFonts w:ascii="Courier New" w:hAnsi="Courier New" w:eastAsia="Courier New"/>
-                <w:sz w:val="18"/>
+                <w:sz w:val="17"/>
               </w:rPr>
               <w:t>"do"        return DO;</w:t>
               <w:br/>
@@ -9463,7 +10541,7 @@
             <w:r>
               <w:rPr>
                 <w:rFonts w:ascii="Courier New" w:hAnsi="Courier New" w:eastAsia="Courier New"/>
-                <w:sz w:val="18"/>
+                <w:sz w:val="17"/>
               </w:rPr>
               <w:t>"for"       return FOR;</w:t>
               <w:br/>
@@ -9471,7 +10549,7 @@
             <w:r>
               <w:rPr>
                 <w:rFonts w:ascii="Courier New" w:hAnsi="Courier New" w:eastAsia="Courier New"/>
-                <w:sz w:val="18"/>
+                <w:sz w:val="17"/>
               </w:rPr>
               <w:t>...</w:t>
               <w:br/>
@@ -9479,7 +10557,7 @@
             <w:r>
               <w:rPr>
                 <w:rFonts w:ascii="Courier New" w:hAnsi="Courier New" w:eastAsia="Courier New"/>
-                <w:sz w:val="18"/>
+                <w:sz w:val="17"/>
               </w:rPr>
               <w:t>[a-zA-Z][a-zA-Z0-9_]* {</w:t>
               <w:br/>
@@ -9487,7 +10565,7 @@
             <w:r>
               <w:rPr>
                 <w:rFonts w:ascii="Courier New" w:hAnsi="Courier New" w:eastAsia="Courier New"/>
-                <w:sz w:val="18"/>
+                <w:sz w:val="17"/>
               </w:rPr>
               <w:t xml:space="preserve">                yylval.sIndex = lookup(yytext);</w:t>
               <w:br/>
@@ -9495,7 +10573,7 @@
             <w:r>
               <w:rPr>
                 <w:rFonts w:ascii="Courier New" w:hAnsi="Courier New" w:eastAsia="Courier New"/>
-                <w:sz w:val="18"/>
+                <w:sz w:val="17"/>
               </w:rPr>
               <w:t xml:space="preserve">                return VARIABLE;</w:t>
               <w:br/>
@@ -9503,7 +10581,7 @@
             <w:r>
               <w:rPr>
                 <w:rFonts w:ascii="Courier New" w:hAnsi="Courier New" w:eastAsia="Courier New"/>
-                <w:sz w:val="18"/>
+                <w:sz w:val="17"/>
               </w:rPr>
               <w:t xml:space="preserve">            }</w:t>
             </w:r>
@@ -10602,6 +11680,14 @@
         <w:jc w:val="both"/>
       </w:pPr>
       <w:r>
+        <w:t>The calculator files have the same names as in the tutorial zip (calc1.l, calc1.y, calc2.l, calc2.y, calc3.h, calc3.l, calc3.y, calc3a.c, calc3b.c, calc3g.c). I typed the four programs from the Lex section into files named ex1.l to ex4.l. The T7 files calc3np.y and calc3t.y and the bonus files calc4.* are my own copies.</w:t>
+      </w:r>
+    </w:p>
+    <w:p>
+      <w:pPr>
+        <w:jc w:val="both"/>
+      </w:pPr>
+      <w:r>
         <w:t>These are the commands that the Makefile runs (written by hand from inside each build folder):</w:t>
       </w:r>
     </w:p>
@@ -10615,7 +11701,7 @@
           <w:b/>
           <w:sz w:val="21"/>
         </w:rPr>
-        <w:t xml:space="preserve">Table 6: </w:t>
+        <w:t xml:space="preserve">Table 7: </w:t>
       </w:r>
       <w:r>
         <w:rPr>
@@ -15257,17 +16343,7 @@
         <w:jc w:val="both"/>
       </w:pPr>
       <w:r>
-        <w:t xml:space="preserve">The output for my input 1 (factorial) is in </w:t>
-      </w:r>
-      <w:r>
-        <w:rPr>
-          <w:rFonts w:ascii="Courier New" w:hAnsi="Courier New"/>
-          <w:sz w:val="22"/>
-        </w:rPr>
-        <w:t>outputs/t5_own1.txt</w:t>
-      </w:r>
-      <w:r>
-        <w:t xml:space="preserve"> and it has one loop like the test program. For the nested if there are two labels for the inner if-else (</w:t>
+        <w:t>For the nested if there are two labels for the inner if-else (</w:t>
       </w:r>
       <w:r>
         <w:rPr>
@@ -15327,7 +16403,7 @@
           <w:i/>
           <w:sz w:val="21"/>
         </w:rPr>
-        <w:t>calc3b on my input 3 (error)</w:t>
+        <w:t>calc3b on my input 1 (factorial, left) and my input 3 (error, right)</w:t>
       </w:r>
     </w:p>
     <w:tbl>
@@ -15344,7 +16420,7 @@
       <w:tr>
         <w:tc>
           <w:tcPr>
-            <w:tcW w:type="dxa" w:w="4706"/>
+            <w:tcW w:type="dxa" w:w="4819"/>
             <w:shd w:val="clear" w:color="auto" w:fill="F3F3F3"/>
           </w:tcPr>
           <w:p>
@@ -15354,39 +16430,247 @@
             <w:r>
               <w:rPr>
                 <w:rFonts w:ascii="Courier New" w:hAnsi="Courier New"/>
-                <w:sz w:val="18"/>
-              </w:rPr>
-              <w:t>$ cat inputs/t4_own3.txt</w:t>
-              <w:br/>
-            </w:r>
-            <w:r>
-              <w:rPr>
-                <w:rFonts w:ascii="Courier New" w:hAnsi="Courier New"/>
-                <w:sz w:val="18"/>
-              </w:rPr>
-              <w:t>x = 4;</w:t>
-              <w:br/>
-            </w:r>
-            <w:r>
-              <w:rPr>
-                <w:rFonts w:ascii="Courier New" w:hAnsi="Courier New"/>
-                <w:sz w:val="18"/>
-              </w:rPr>
-              <w:t>print x +;</w:t>
-              <w:br/>
-            </w:r>
-            <w:r>
-              <w:rPr>
-                <w:rFonts w:ascii="Courier New" w:hAnsi="Courier New"/>
-                <w:sz w:val="18"/>
-              </w:rPr>
-              <w:t>print 99;</w:t>
+                <w:sz w:val="17"/>
+              </w:rPr>
+              <w:t>$ cat inputs/t4_own1.txt</w:t>
+              <w:br/>
+            </w:r>
+            <w:r>
+              <w:rPr>
+                <w:rFonts w:ascii="Courier New" w:hAnsi="Courier New"/>
+                <w:sz w:val="17"/>
+              </w:rPr>
+              <w:t>n = 5;</w:t>
+              <w:br/>
+            </w:r>
+            <w:r>
+              <w:rPr>
+                <w:rFonts w:ascii="Courier New" w:hAnsi="Courier New"/>
+                <w:sz w:val="17"/>
+              </w:rPr>
+              <w:t>f = 1;</w:t>
+              <w:br/>
+            </w:r>
+            <w:r>
+              <w:rPr>
+                <w:rFonts w:ascii="Courier New" w:hAnsi="Courier New"/>
+                <w:sz w:val="17"/>
+              </w:rPr>
+              <w:t>while (n &gt; 1) {</w:t>
+              <w:br/>
+            </w:r>
+            <w:r>
+              <w:rPr>
+                <w:rFonts w:ascii="Courier New" w:hAnsi="Courier New"/>
+                <w:sz w:val="17"/>
+              </w:rPr>
+              <w:t xml:space="preserve">    f = f * n;</w:t>
+              <w:br/>
+            </w:r>
+            <w:r>
+              <w:rPr>
+                <w:rFonts w:ascii="Courier New" w:hAnsi="Courier New"/>
+                <w:sz w:val="17"/>
+              </w:rPr>
+              <w:t xml:space="preserve">    n = n - 1;</w:t>
+              <w:br/>
+            </w:r>
+            <w:r>
+              <w:rPr>
+                <w:rFonts w:ascii="Courier New" w:hAnsi="Courier New"/>
+                <w:sz w:val="17"/>
+              </w:rPr>
+              <w:t>}</w:t>
+              <w:br/>
+            </w:r>
+            <w:r>
+              <w:rPr>
+                <w:rFonts w:ascii="Courier New" w:hAnsi="Courier New"/>
+                <w:sz w:val="17"/>
+              </w:rPr>
+              <w:t>print f;</w:t>
+              <w:br/>
+            </w:r>
+            <w:r>
+              <w:rPr>
+                <w:rFonts w:ascii="Courier New" w:hAnsi="Courier New"/>
+                <w:sz w:val="17"/>
+              </w:rPr>
+              <w:t>$ ./calc3b &lt; inputs/t4_own1.txt</w:t>
+              <w:br/>
+            </w:r>
+            <w:r>
+              <w:rPr>
+                <w:rFonts w:ascii="Courier New" w:hAnsi="Courier New"/>
+                <w:sz w:val="17"/>
+              </w:rPr>
+              <w:t xml:space="preserve">    push    5</w:t>
+              <w:br/>
+            </w:r>
+            <w:r>
+              <w:rPr>
+                <w:rFonts w:ascii="Courier New" w:hAnsi="Courier New"/>
+                <w:sz w:val="17"/>
+              </w:rPr>
+              <w:t xml:space="preserve">    pop    n</w:t>
+              <w:br/>
+            </w:r>
+            <w:r>
+              <w:rPr>
+                <w:rFonts w:ascii="Courier New" w:hAnsi="Courier New"/>
+                <w:sz w:val="17"/>
+              </w:rPr>
+              <w:t xml:space="preserve">    push    1</w:t>
+              <w:br/>
+            </w:r>
+            <w:r>
+              <w:rPr>
+                <w:rFonts w:ascii="Courier New" w:hAnsi="Courier New"/>
+                <w:sz w:val="17"/>
+              </w:rPr>
+              <w:t xml:space="preserve">    pop    f</w:t>
+              <w:br/>
+            </w:r>
+            <w:r>
+              <w:rPr>
+                <w:rFonts w:ascii="Courier New" w:hAnsi="Courier New"/>
+                <w:sz w:val="17"/>
+              </w:rPr>
+              <w:t>L000:</w:t>
+              <w:br/>
+            </w:r>
+            <w:r>
+              <w:rPr>
+                <w:rFonts w:ascii="Courier New" w:hAnsi="Courier New"/>
+                <w:sz w:val="17"/>
+              </w:rPr>
+              <w:t xml:space="preserve">    push    n</w:t>
+              <w:br/>
+            </w:r>
+            <w:r>
+              <w:rPr>
+                <w:rFonts w:ascii="Courier New" w:hAnsi="Courier New"/>
+                <w:sz w:val="17"/>
+              </w:rPr>
+              <w:t xml:space="preserve">    push    1</w:t>
+              <w:br/>
+            </w:r>
+            <w:r>
+              <w:rPr>
+                <w:rFonts w:ascii="Courier New" w:hAnsi="Courier New"/>
+                <w:sz w:val="17"/>
+              </w:rPr>
+              <w:t xml:space="preserve">    compGT</w:t>
+              <w:br/>
+            </w:r>
+            <w:r>
+              <w:rPr>
+                <w:rFonts w:ascii="Courier New" w:hAnsi="Courier New"/>
+                <w:sz w:val="17"/>
+              </w:rPr>
+              <w:t xml:space="preserve">    jz    L001</w:t>
+              <w:br/>
+            </w:r>
+            <w:r>
+              <w:rPr>
+                <w:rFonts w:ascii="Courier New" w:hAnsi="Courier New"/>
+                <w:sz w:val="17"/>
+              </w:rPr>
+              <w:t xml:space="preserve">    push    f</w:t>
+              <w:br/>
+            </w:r>
+            <w:r>
+              <w:rPr>
+                <w:rFonts w:ascii="Courier New" w:hAnsi="Courier New"/>
+                <w:sz w:val="17"/>
+              </w:rPr>
+              <w:t xml:space="preserve">    push    n</w:t>
+              <w:br/>
+            </w:r>
+            <w:r>
+              <w:rPr>
+                <w:rFonts w:ascii="Courier New" w:hAnsi="Courier New"/>
+                <w:sz w:val="17"/>
+              </w:rPr>
+              <w:t xml:space="preserve">    mul</w:t>
+              <w:br/>
+            </w:r>
+            <w:r>
+              <w:rPr>
+                <w:rFonts w:ascii="Courier New" w:hAnsi="Courier New"/>
+                <w:sz w:val="17"/>
+              </w:rPr>
+              <w:t xml:space="preserve">    pop    f</w:t>
+              <w:br/>
+            </w:r>
+            <w:r>
+              <w:rPr>
+                <w:rFonts w:ascii="Courier New" w:hAnsi="Courier New"/>
+                <w:sz w:val="17"/>
+              </w:rPr>
+              <w:t xml:space="preserve">    push    n</w:t>
+              <w:br/>
+            </w:r>
+            <w:r>
+              <w:rPr>
+                <w:rFonts w:ascii="Courier New" w:hAnsi="Courier New"/>
+                <w:sz w:val="17"/>
+              </w:rPr>
+              <w:t xml:space="preserve">    push    1</w:t>
+              <w:br/>
+            </w:r>
+            <w:r>
+              <w:rPr>
+                <w:rFonts w:ascii="Courier New" w:hAnsi="Courier New"/>
+                <w:sz w:val="17"/>
+              </w:rPr>
+              <w:t xml:space="preserve">    sub</w:t>
+              <w:br/>
+            </w:r>
+            <w:r>
+              <w:rPr>
+                <w:rFonts w:ascii="Courier New" w:hAnsi="Courier New"/>
+                <w:sz w:val="17"/>
+              </w:rPr>
+              <w:t xml:space="preserve">    pop    n</w:t>
+              <w:br/>
+            </w:r>
+            <w:r>
+              <w:rPr>
+                <w:rFonts w:ascii="Courier New" w:hAnsi="Courier New"/>
+                <w:sz w:val="17"/>
+              </w:rPr>
+              <w:t xml:space="preserve">    jmp    L000</w:t>
+              <w:br/>
+            </w:r>
+            <w:r>
+              <w:rPr>
+                <w:rFonts w:ascii="Courier New" w:hAnsi="Courier New"/>
+                <w:sz w:val="17"/>
+              </w:rPr>
+              <w:t>L001:</w:t>
+              <w:br/>
+            </w:r>
+            <w:r>
+              <w:rPr>
+                <w:rFonts w:ascii="Courier New" w:hAnsi="Courier New"/>
+                <w:sz w:val="17"/>
+              </w:rPr>
+              <w:t xml:space="preserve">    push    f</w:t>
+              <w:br/>
+            </w:r>
+            <w:r>
+              <w:rPr>
+                <w:rFonts w:ascii="Courier New" w:hAnsi="Courier New"/>
+                <w:sz w:val="17"/>
+              </w:rPr>
+              <w:t xml:space="preserve">    print</w:t>
             </w:r>
           </w:p>
         </w:tc>
         <w:tc>
           <w:tcPr>
-            <w:tcW w:type="dxa" w:w="4706"/>
+            <w:tcW w:type="dxa" w:w="4819"/>
             <w:shd w:val="clear" w:color="auto" w:fill="F3F3F3"/>
           </w:tcPr>
           <w:p>
@@ -15396,7 +16680,39 @@
             <w:r>
               <w:rPr>
                 <w:rFonts w:ascii="Courier New" w:hAnsi="Courier New"/>
-                <w:sz w:val="18"/>
+                <w:sz w:val="17"/>
+              </w:rPr>
+              <w:t>$ cat inputs/t4_own3.txt</w:t>
+              <w:br/>
+            </w:r>
+            <w:r>
+              <w:rPr>
+                <w:rFonts w:ascii="Courier New" w:hAnsi="Courier New"/>
+                <w:sz w:val="17"/>
+              </w:rPr>
+              <w:t>x = 4;</w:t>
+              <w:br/>
+            </w:r>
+            <w:r>
+              <w:rPr>
+                <w:rFonts w:ascii="Courier New" w:hAnsi="Courier New"/>
+                <w:sz w:val="17"/>
+              </w:rPr>
+              <w:t>print x +;</w:t>
+              <w:br/>
+            </w:r>
+            <w:r>
+              <w:rPr>
+                <w:rFonts w:ascii="Courier New" w:hAnsi="Courier New"/>
+                <w:sz w:val="17"/>
+              </w:rPr>
+              <w:t>print 99;</w:t>
+              <w:br/>
+            </w:r>
+            <w:r>
+              <w:rPr>
+                <w:rFonts w:ascii="Courier New" w:hAnsi="Courier New"/>
+                <w:sz w:val="17"/>
               </w:rPr>
               <w:t>$ ./calc3b &lt; inputs/t4_own3.txt</w:t>
               <w:br/>
@@ -15404,7 +16720,7 @@
             <w:r>
               <w:rPr>
                 <w:rFonts w:ascii="Courier New" w:hAnsi="Courier New"/>
-                <w:sz w:val="18"/>
+                <w:sz w:val="17"/>
               </w:rPr>
               <w:t xml:space="preserve">    push    4</w:t>
               <w:br/>
@@ -15412,7 +16728,7 @@
             <w:r>
               <w:rPr>
                 <w:rFonts w:ascii="Courier New" w:hAnsi="Courier New"/>
-                <w:sz w:val="18"/>
+                <w:sz w:val="17"/>
               </w:rPr>
               <w:t xml:space="preserve">    pop    x</w:t>
               <w:br/>
@@ -15420,7 +16736,7 @@
             <w:r>
               <w:rPr>
                 <w:rFonts w:ascii="Courier New" w:hAnsi="Courier New"/>
-                <w:sz w:val="18"/>
+                <w:sz w:val="17"/>
               </w:rPr>
               <w:t>syntax error</w:t>
             </w:r>
@@ -15438,7 +16754,27 @@
         <w:jc w:val="both"/>
       </w:pPr>
       <w:r>
-        <w:t>The first statement is compiled and then the error stops the parser.</w:t>
+        <w:t xml:space="preserve">The factorial program has one loop with the same shape as the test program and ends with </w:t>
+      </w:r>
+      <w:r>
+        <w:rPr>
+          <w:rFonts w:ascii="Courier New" w:hAnsi="Courier New"/>
+          <w:sz w:val="22"/>
+        </w:rPr>
+        <w:t>push f</w:t>
+      </w:r>
+      <w:r>
+        <w:t xml:space="preserve"> and </w:t>
+      </w:r>
+      <w:r>
+        <w:rPr>
+          <w:rFonts w:ascii="Courier New" w:hAnsi="Courier New"/>
+          <w:sz w:val="22"/>
+        </w:rPr>
+        <w:t>print</w:t>
+      </w:r>
+      <w:r>
+        <w:t>. In input 3 the first statement is compiled and then the error stops the parser.</w:t>
       </w:r>
     </w:p>
     <w:tbl>
@@ -17424,7 +18760,7 @@
             <w:r>
               <w:rPr>
                 <w:rFonts w:ascii="Courier New" w:hAnsi="Courier New" w:eastAsia="Courier New"/>
-                <w:sz w:val="18"/>
+                <w:sz w:val="17"/>
               </w:rPr>
               <w:t>calc3np.y: warning: 110 shift/reduce conflicts [-Wconflicts-sr]</w:t>
             </w:r>
@@ -17503,7 +18839,7 @@
             <w:r>
               <w:rPr>
                 <w:rFonts w:ascii="Courier New" w:hAnsi="Courier New" w:eastAsia="Courier New"/>
-                <w:sz w:val="18"/>
+                <w:sz w:val="17"/>
               </w:rPr>
               <w:t>State 23 conflicts: 10 shift/reduce</w:t>
               <w:br/>
@@ -17511,7 +18847,7 @@
             <w:r>
               <w:rPr>
                 <w:rFonts w:ascii="Courier New" w:hAnsi="Courier New" w:eastAsia="Courier New"/>
-                <w:sz w:val="18"/>
+                <w:sz w:val="17"/>
               </w:rPr>
               <w:t>State 42 conflicts: 10 shift/reduce</w:t>
               <w:br/>
@@ -17519,7 +18855,7 @@
             <w:r>
               <w:rPr>
                 <w:rFonts w:ascii="Courier New" w:hAnsi="Courier New" w:eastAsia="Courier New"/>
-                <w:sz w:val="18"/>
+                <w:sz w:val="17"/>
               </w:rPr>
               <w:t>State 43 conflicts: 10 shift/reduce</w:t>
               <w:br/>
@@ -17527,7 +18863,7 @@
             <w:r>
               <w:rPr>
                 <w:rFonts w:ascii="Courier New" w:hAnsi="Courier New" w:eastAsia="Courier New"/>
-                <w:sz w:val="18"/>
+                <w:sz w:val="17"/>
               </w:rPr>
               <w:t>State 44 conflicts: 10 shift/reduce</w:t>
               <w:br/>
@@ -17535,7 +18871,7 @@
             <w:r>
               <w:rPr>
                 <w:rFonts w:ascii="Courier New" w:hAnsi="Courier New" w:eastAsia="Courier New"/>
-                <w:sz w:val="18"/>
+                <w:sz w:val="17"/>
               </w:rPr>
               <w:t>State 45 conflicts: 10 shift/reduce</w:t>
               <w:br/>
@@ -17543,7 +18879,7 @@
             <w:r>
               <w:rPr>
                 <w:rFonts w:ascii="Courier New" w:hAnsi="Courier New" w:eastAsia="Courier New"/>
-                <w:sz w:val="18"/>
+                <w:sz w:val="17"/>
               </w:rPr>
               <w:t>State 46 conflicts: 10 shift/reduce</w:t>
               <w:br/>
@@ -17551,7 +18887,7 @@
             <w:r>
               <w:rPr>
                 <w:rFonts w:ascii="Courier New" w:hAnsi="Courier New" w:eastAsia="Courier New"/>
-                <w:sz w:val="18"/>
+                <w:sz w:val="17"/>
               </w:rPr>
               <w:t>State 47 conflicts: 10 shift/reduce</w:t>
               <w:br/>
@@ -17559,7 +18895,7 @@
             <w:r>
               <w:rPr>
                 <w:rFonts w:ascii="Courier New" w:hAnsi="Courier New" w:eastAsia="Courier New"/>
-                <w:sz w:val="18"/>
+                <w:sz w:val="17"/>
               </w:rPr>
               <w:t>State 48 conflicts: 10 shift/reduce</w:t>
               <w:br/>
@@ -17567,7 +18903,7 @@
             <w:r>
               <w:rPr>
                 <w:rFonts w:ascii="Courier New" w:hAnsi="Courier New" w:eastAsia="Courier New"/>
-                <w:sz w:val="18"/>
+                <w:sz w:val="17"/>
               </w:rPr>
               <w:t>State 49 conflicts: 10 shift/reduce</w:t>
               <w:br/>
@@ -17575,7 +18911,7 @@
             <w:r>
               <w:rPr>
                 <w:rFonts w:ascii="Courier New" w:hAnsi="Courier New" w:eastAsia="Courier New"/>
-                <w:sz w:val="18"/>
+                <w:sz w:val="17"/>
               </w:rPr>
               <w:t>State 50 conflicts: 10 shift/reduce</w:t>
               <w:br/>
@@ -17583,7 +18919,7 @@
             <w:r>
               <w:rPr>
                 <w:rFonts w:ascii="Courier New" w:hAnsi="Courier New" w:eastAsia="Courier New"/>
-                <w:sz w:val="18"/>
+                <w:sz w:val="17"/>
               </w:rPr>
               <w:t>State 51 conflicts: 10 shift/reduce</w:t>
             </w:r>

</xml_diff>

<commit_message>
Keep only problems that actually happened in the report
Co-Authored-By: Claude Opus 5.5 <noreply@anthropic.com>
Claude-Session: https://claude.ai/code/session_01QcNyLCXcvqPYgnNJtFAvRc
</commit_message>
<xml_diff>
--- a/mini_project/report_editable.docx
+++ b/mini_project/report_editable.docx
@@ -12126,7 +12126,7 @@
         <w:rPr>
           <w:b/>
         </w:rPr>
-        <w:t>undefined reference to yywrap.</w:t>
+        <w:t>yywrap.</w:t>
       </w:r>
       <w:r>
         <w:t xml:space="preserve"> ex2, ex3 and ex4 do not define </w:t>
@@ -12139,7 +12139,7 @@
         <w:t>yywrap()</w:t>
       </w:r>
       <w:r>
-        <w:t xml:space="preserve">. I fixed it by linking with </w:t>
+        <w:t xml:space="preserve">, so I linked them with </w:t>
       </w:r>
       <w:r>
         <w:rPr>
@@ -12149,7 +12149,17 @@
         <w:t>-lfl</w:t>
       </w:r>
       <w:r>
-        <w:t xml:space="preserve"> like the project sheet says.</w:t>
+        <w:t xml:space="preserve"> like the project sheet says. Without it the linker cannot find </w:t>
+      </w:r>
+      <w:r>
+        <w:rPr>
+          <w:rFonts w:ascii="Courier New" w:hAnsi="Courier New"/>
+          <w:sz w:val="22"/>
+        </w:rPr>
+        <w:t>yywrap</w:t>
+      </w:r>
+      <w:r>
+        <w:t>.</w:t>
       </w:r>
     </w:p>
     <w:p>
@@ -12268,21 +12278,6 @@
       </w:r>
       <w:r>
         <w:t xml:space="preserve"> in the Makefile so stdout is flushed after every line.</w:t>
-      </w:r>
-    </w:p>
-    <w:p>
-      <w:pPr>
-        <w:pStyle w:val="ListNumber"/>
-        <w:spacing w:after="40"/>
-      </w:pPr>
-      <w:r>
-        <w:rPr>
-          <w:b/>
-        </w:rPr>
-        <w:t>y.tab.h overwritten between tasks.</w:t>
-      </w:r>
-      <w:r>
-        <w:t xml:space="preserve"> At first I built everything in one folder and calc2 used the y.tab.h of calc3. Using a separate build folder for each task fixed it.</w:t>
       </w:r>
     </w:p>
     <w:p>

</xml_diff>